<commit_message>
Expand Book Five Part Two with four new scenes
Add one scene to each of Chapters 6-9 in chronological place:
Saif the shell-opener and the debt-chain (6); the freed bean-seller
who teaches the search method (7); Nura's birth and the poem-as-
channel pedagogy (8); the horse-yard dam recitation foreshadowing
Recite the Dams (9). Part Two now ~14.4k. Voice preserved; no
anachronisms introduced.

Co-authored-by: eddiegcs <eddiegcs@users.noreply.github.com>
</commit_message>
<xml_diff>
--- a/___projects/Books/Arabia!/Arabia_Bk5_v9_manuscript.docx
+++ b/___projects/Books/Arabia!/Arabia_Bk5_v9_manuscript.docx
@@ -4248,35 +4248,91 @@
           <w:b w:val="0"/>
           <w:sz w:val="27"/>
         </w:rPr>
-        <w:t>Before the turn, the book will give you the calm supper it promised, because a reader who has not been fed on the deck cannot feel what the arithmetic steals.</w:t>
-      </w:r>
-    </w:p>
-    <w:p>
-      <w:pPr>
-        <w:spacing w:line="348" w:lineRule="auto" w:after="0" w:before="0"/>
-        <w:ind w:firstLine="288"/>
-      </w:pPr>
-      <w:r>
-        <w:rPr>
-          <w:rFonts w:ascii="EB Garamond" w:hAnsi="EB Garamond"/>
-          <w:b w:val="0"/>
-          <w:sz w:val="27"/>
-        </w:rPr>
-        <w:t>That week the catch had been decent — not a fortune, a living — and the cook put rice and fish in the one broad dish, and the men ate with the right hand in the order the boat knew, and there were dates, and the water from the barrel tasted of copper and old wood, and for an hour the debt was only a book in a box and not a rope around a throat. A young man they called the nahham gave them a scrap of the haul-song, the chant that timed the pull on the ropes, and for the length of it the work had a music in it that was not only suffering.</w:t>
-      </w:r>
-    </w:p>
-    <w:p>
-      <w:pPr>
-        <w:spacing w:line="348" w:lineRule="auto" w:after="0" w:before="0"/>
-        <w:ind w:firstLine="288"/>
-      </w:pPr>
-      <w:r>
-        <w:rPr>
-          <w:rFonts w:ascii="EB Garamond" w:hAnsi="EB Garamond"/>
-          <w:b w:val="0"/>
-          <w:sz w:val="27"/>
-        </w:rPr>
-        <w:t>Khamis ate. He thought of Wadha's kitchen and the soured milk and the sentence she kept, and he understood that a man could sit inside two hungers at once: the body's, which the rice answered, and the other, which no catch would ever answer. He did not speak Munira's name on that deck. He asked, in the sideways way, after women brought up the trade in such-and-such years, and he was given rumors and shrugs and, once, a hard look that told him to leave it. He left it. He filed the faces. He kept the tally.</w:t>
+        <w:t>The man who taught him the true shape of the debt was not a diver at all but a shell-opener, an old man the boat called Saif, whose thumbs had been ruined so long ago that he opened the oysters more by memory than by grip. Khamis sat with him in the shade of the sail through the flat middle of the day, when the divers rested against the next descent, and learned the chain link by link, the way he had once learned the rota.</w:t>
+      </w:r>
+    </w:p>
+    <w:p>
+      <w:pPr>
+        <w:spacing w:line="348" w:lineRule="auto" w:after="0" w:before="0"/>
+        <w:ind w:firstLine="288"/>
+      </w:pPr>
+      <w:r>
+        <w:rPr>
+          <w:rFonts w:ascii="EB Garamond" w:hAnsi="EB Garamond"/>
+          <w:b w:val="0"/>
+          <w:sz w:val="27"/>
+        </w:rPr>
+        <w:t>"You think the nakhoda owns us," Saif said, not looking up from the blade. "The nakhoda owes the tawwash. The tawwash owes a bigger man in the town, who owes a house in Bahrain, who owes an Indian across the water, who now — they say — owes the price the wire tells him each morning before he has washed his face." He slid a shell open, glanced, discarded. "We are the bottom knot of a rope that goes up past where any of us can see. When the top of the rope pulls, it is the bottom knot that feels it in the throat."</w:t>
+      </w:r>
+    </w:p>
+    <w:p>
+      <w:pPr>
+        <w:spacing w:line="348" w:lineRule="auto" w:after="0" w:before="0"/>
+        <w:ind w:firstLine="288"/>
+      </w:pPr>
+      <w:r>
+        <w:rPr>
+          <w:rFonts w:ascii="EB Garamond" w:hAnsi="EB Garamond"/>
+          <w:b w:val="0"/>
+          <w:sz w:val="27"/>
+        </w:rPr>
+        <w:t>"And if the bottom knot learns to count?" Khamis asked.</w:t>
+      </w:r>
+    </w:p>
+    <w:p>
+      <w:pPr>
+        <w:spacing w:line="348" w:lineRule="auto" w:after="0" w:before="0"/>
+        <w:ind w:firstLine="288"/>
+      </w:pPr>
+      <w:r>
+        <w:rPr>
+          <w:rFonts w:ascii="EB Garamond" w:hAnsi="EB Garamond"/>
+          <w:b w:val="0"/>
+          <w:sz w:val="27"/>
+        </w:rPr>
+        <w:t>Saif looked at him then, with eyes gone pale at the rims from a life of salt and glare. "Then the bottom knot is dangerous, and is either made a foreman or made an example. There is no third road for a man who counts on a boat that lives by miscounting." He went back to the blade. "You are counting. I have watched you. Count quietly, and know which one they will make you, and be ready to be neither."</w:t>
+      </w:r>
+    </w:p>
+    <w:p>
+      <w:pPr>
+        <w:spacing w:line="348" w:lineRule="auto" w:after="0" w:before="0"/>
+        <w:ind w:firstLine="288"/>
+      </w:pPr>
+      <w:r>
+        <w:rPr>
+          <w:rFonts w:ascii="EB Garamond" w:hAnsi="EB Garamond"/>
+          <w:b w:val="0"/>
+          <w:sz w:val="27"/>
+        </w:rPr>
+        <w:t>Khamis kept that beside the keeper's law and the two camels. He had come out to buy questions with a wage; he was being given, without asking, an education in how the whole century's money would learn to move — up a rope, over water, faster than mercy, and always, in the end, felt first in the throat of the man at the bottom.</w:t>
+      </w:r>
+    </w:p>
+    <w:p>
+      <w:pPr>
+        <w:spacing w:line="348" w:lineRule="auto" w:after="0" w:before="0"/>
+        <w:ind w:firstLine="288"/>
+      </w:pPr>
+      <w:r>
+        <w:rPr>
+          <w:rFonts w:ascii="EB Garamond" w:hAnsi="EB Garamond"/>
+          <w:b w:val="0"/>
+          <w:sz w:val="27"/>
+        </w:rPr>
+        <w:t>"Why tell me?" Khamis asked.</w:t>
+      </w:r>
+    </w:p>
+    <w:p>
+      <w:pPr>
+        <w:spacing w:line="348" w:lineRule="auto" w:after="0" w:before="0"/>
+        <w:ind w:firstLine="288"/>
+      </w:pPr>
+      <w:r>
+        <w:rPr>
+          <w:rFonts w:ascii="EB Garamond" w:hAnsi="EB Garamond"/>
+          <w:b w:val="0"/>
+          <w:sz w:val="27"/>
+        </w:rPr>
+        <w:t>"Because you gave me your dates yesterday when you thought no one saw," Saif said. "A man who feeds the ruined is a man I will spend a little breath on before the sea spends the rest of mine."</w:t>
       </w:r>
     </w:p>
     <w:p>
@@ -4305,77 +4361,35 @@
           <w:b w:val="0"/>
           <w:sz w:val="27"/>
         </w:rPr>
-        <w:t>On the seventh evening the nakhoda had the men open a stubborn set of shells, and among the nothing and the seed-pearls there was one round white that made even the tired divers go quiet. The tawwash's man, aboard that night, turned it in the last light and smiled a small smile and named a grade a full step below what every eye on the deck had seen.</w:t>
-      </w:r>
-    </w:p>
-    <w:p>
-      <w:pPr>
-        <w:spacing w:line="348" w:lineRule="auto" w:after="0" w:before="0"/>
-        <w:ind w:firstLine="288"/>
-      </w:pPr>
-      <w:r>
-        <w:rPr>
-          <w:rFonts w:ascii="EB Garamond" w:hAnsi="EB Garamond"/>
-          <w:b w:val="0"/>
-          <w:sz w:val="27"/>
-        </w:rPr>
-        <w:t>Later Khamis said to the diver who had brought it up, privately, "Say what you saw."</w:t>
-      </w:r>
-    </w:p>
-    <w:p>
-      <w:pPr>
-        <w:spacing w:line="348" w:lineRule="auto" w:after="0" w:before="0"/>
-        <w:ind w:firstLine="288"/>
-      </w:pPr>
-      <w:r>
-        <w:rPr>
-          <w:rFonts w:ascii="EB Garamond" w:hAnsi="EB Garamond"/>
-          <w:b w:val="0"/>
-          <w:sz w:val="27"/>
-        </w:rPr>
-        <w:t>"I saw a better pearl," the diver said.</w:t>
-      </w:r>
-    </w:p>
-    <w:p>
-      <w:pPr>
-        <w:spacing w:line="348" w:lineRule="auto" w:after="0" w:before="0"/>
-        <w:ind w:firstLine="288"/>
-      </w:pPr>
-      <w:r>
-        <w:rPr>
-          <w:rFonts w:ascii="EB Garamond" w:hAnsi="EB Garamond"/>
-          <w:b w:val="0"/>
-          <w:sz w:val="27"/>
-        </w:rPr>
-        <w:t>"And now?"</w:t>
-      </w:r>
-    </w:p>
-    <w:p>
-      <w:pPr>
-        <w:spacing w:line="348" w:lineRule="auto" w:after="0" w:before="0"/>
-        <w:ind w:firstLine="288"/>
-      </w:pPr>
-      <w:r>
-        <w:rPr>
-          <w:rFonts w:ascii="EB Garamond" w:hAnsi="EB Garamond"/>
-          <w:b w:val="0"/>
-          <w:sz w:val="27"/>
-        </w:rPr>
-        <w:t>"Now I see what I am permitted to see."</w:t>
-      </w:r>
-    </w:p>
-    <w:p>
-      <w:pPr>
-        <w:spacing w:line="348" w:lineRule="auto" w:after="0" w:before="0"/>
-        <w:ind w:firstLine="288"/>
-      </w:pPr>
-      <w:r>
-        <w:rPr>
-          <w:rFonts w:ascii="EB Garamond" w:hAnsi="EB Garamond"/>
-          <w:b w:val="0"/>
-          <w:sz w:val="27"/>
-        </w:rPr>
-        <w:t>Khamis did not sleep well. He lay counting the distance between a thing and its written shadow, and when at last he slept he dreamed of Yaqut asking whether there would be a mother where they were going, and he woke with the old kind answer still in his mouth, unspent.</w:t>
+        <w:t>Before the turn, the book will give you the calm supper it promised, because a reader who has not been fed on the deck cannot feel what the arithmetic steals.</w:t>
+      </w:r>
+    </w:p>
+    <w:p>
+      <w:pPr>
+        <w:spacing w:line="348" w:lineRule="auto" w:after="0" w:before="0"/>
+        <w:ind w:firstLine="288"/>
+      </w:pPr>
+      <w:r>
+        <w:rPr>
+          <w:rFonts w:ascii="EB Garamond" w:hAnsi="EB Garamond"/>
+          <w:b w:val="0"/>
+          <w:sz w:val="27"/>
+        </w:rPr>
+        <w:t>That week the catch had been decent — not a fortune, a living — and the cook put rice and fish in the one broad dish, and the men ate with the right hand in the order the boat knew, and there were dates, and the water from the barrel tasted of copper and old wood, and for an hour the debt was only a book in a box and not a rope around a throat. A young man they called the nahham gave them a scrap of the haul-song, the chant that timed the pull on the ropes, and for the length of it the work had a music in it that was not only suffering.</w:t>
+      </w:r>
+    </w:p>
+    <w:p>
+      <w:pPr>
+        <w:spacing w:line="348" w:lineRule="auto" w:after="0" w:before="0"/>
+        <w:ind w:firstLine="288"/>
+      </w:pPr>
+      <w:r>
+        <w:rPr>
+          <w:rFonts w:ascii="EB Garamond" w:hAnsi="EB Garamond"/>
+          <w:b w:val="0"/>
+          <w:sz w:val="27"/>
+        </w:rPr>
+        <w:t>Khamis ate. He thought of Wadha's kitchen and the soured milk and the sentence she kept, and he understood that a man could sit inside two hungers at once: the body's, which the rice answered, and the other, which no catch would ever answer. He did not speak Munira's name on that deck. He asked, in the sideways way, after women brought up the trade in such-and-such years, and he was given rumors and shrugs and, once, a hard look that told him to leave it. He left it. He filed the faces. He kept the tally.</w:t>
       </w:r>
     </w:p>
     <w:p>
@@ -4404,231 +4418,77 @@
           <w:b w:val="0"/>
           <w:sz w:val="27"/>
         </w:rPr>
-        <w:t>Then the good week broke.</w:t>
-      </w:r>
-    </w:p>
-    <w:p>
-      <w:pPr>
-        <w:spacing w:line="348" w:lineRule="auto" w:after="0" w:before="0"/>
-        <w:ind w:firstLine="288"/>
-      </w:pPr>
-      <w:r>
-        <w:rPr>
-          <w:rFonts w:ascii="EB Garamond" w:hAnsi="EB Garamond"/>
-          <w:b w:val="0"/>
-          <w:sz w:val="27"/>
-        </w:rPr>
-        <w:t>A diver went down on his own rope — the phrase the men used, which meant the stone and the breath and the bottom and the moment the pull did not come when it should have come. They hauled. What came up was not a man who could gasp and go again. The sea had finished with him in the middle of a sentence of work, the way the sea finished with men, without a speech and without a warning.</w:t>
-      </w:r>
-    </w:p>
-    <w:p>
-      <w:pPr>
-        <w:spacing w:line="348" w:lineRule="auto" w:after="0" w:before="0"/>
-        <w:ind w:firstLine="288"/>
-      </w:pPr>
-      <w:r>
-        <w:rPr>
-          <w:rFonts w:ascii="EB Garamond" w:hAnsi="EB Garamond"/>
-          <w:b w:val="0"/>
-          <w:sz w:val="27"/>
-        </w:rPr>
-        <w:t>They did what boats do. They covered him. They said the words over him. And then, before the sun had moved far, they reckoned how the day's catch and the dead man's debt would be entered, because a body that dies still leaves numbers behind it, and numbers do not pause for grief.</w:t>
-      </w:r>
-    </w:p>
-    <w:p>
-      <w:pPr>
-        <w:spacing w:line="348" w:lineRule="auto" w:after="0" w:before="0"/>
-        <w:ind w:firstLine="288"/>
-      </w:pPr>
-      <w:r>
-        <w:rPr>
-          <w:rFonts w:ascii="EB Garamond" w:hAnsi="EB Garamond"/>
-          <w:b w:val="0"/>
-          <w:sz w:val="27"/>
-        </w:rPr>
-        <w:t>"Write him clean," said one of the older divers, meaning: do not load his brother with a debt you have invented.</w:t>
-      </w:r>
-    </w:p>
-    <w:p>
-      <w:pPr>
-        <w:spacing w:line="348" w:lineRule="auto" w:after="0" w:before="0"/>
-        <w:ind w:firstLine="288"/>
-      </w:pPr>
-      <w:r>
-        <w:rPr>
-          <w:rFonts w:ascii="EB Garamond" w:hAnsi="EB Garamond"/>
-          <w:b w:val="0"/>
-          <w:sz w:val="27"/>
-        </w:rPr>
-        <w:t>"We write what is owed," the nakhoda said.</w:t>
-      </w:r>
-    </w:p>
-    <w:p>
-      <w:pPr>
-        <w:spacing w:line="348" w:lineRule="auto" w:after="0" w:before="0"/>
-        <w:ind w:firstLine="288"/>
-      </w:pPr>
-      <w:r>
-        <w:rPr>
-          <w:rFonts w:ascii="EB Garamond" w:hAnsi="EB Garamond"/>
-          <w:b w:val="0"/>
-          <w:sz w:val="27"/>
-        </w:rPr>
-        <w:t>Khamis heard both sentences and felt the old coldness from the dhow's hold — the arithmetic of persons — come up the rope with the corpse and sit down among the living.</w:t>
-      </w:r>
-    </w:p>
-    <w:p>
-      <w:pPr>
-        <w:spacing w:line="348" w:lineRule="auto" w:after="0" w:before="0"/>
-        <w:ind w:firstLine="288"/>
-      </w:pPr>
-      <w:r>
-        <w:rPr>
-          <w:rFonts w:ascii="EB Garamond" w:hAnsi="EB Garamond"/>
-          <w:b w:val="0"/>
-          <w:sz w:val="27"/>
-        </w:rPr>
-        <w:t>That night he asked to see the book.</w:t>
-      </w:r>
-    </w:p>
-    <w:p>
-      <w:pPr>
-        <w:spacing w:line="348" w:lineRule="auto" w:after="0" w:before="0"/>
-        <w:ind w:firstLine="288"/>
-      </w:pPr>
-      <w:r>
-        <w:rPr>
-          <w:rFonts w:ascii="EB Garamond" w:hAnsi="EB Garamond"/>
-          <w:b w:val="0"/>
-          <w:sz w:val="27"/>
-        </w:rPr>
-        <w:t>The nakhoda laughed. "You are not the owner."</w:t>
-      </w:r>
-    </w:p>
-    <w:p>
-      <w:pPr>
-        <w:spacing w:line="348" w:lineRule="auto" w:after="0" w:before="0"/>
-        <w:ind w:firstLine="288"/>
-      </w:pPr>
-      <w:r>
-        <w:rPr>
-          <w:rFonts w:ascii="EB Garamond" w:hAnsi="EB Garamond"/>
-          <w:b w:val="0"/>
-          <w:sz w:val="27"/>
-        </w:rPr>
-        <w:t>"I am the man who has been keeping your numbers in his head all season," Khamis said. "I would only like to see whether your page and my head agree."</w:t>
-      </w:r>
-    </w:p>
-    <w:p>
-      <w:pPr>
-        <w:spacing w:line="348" w:lineRule="auto" w:after="0" w:before="0"/>
-        <w:ind w:firstLine="288"/>
-      </w:pPr>
-      <w:r>
-        <w:rPr>
-          <w:rFonts w:ascii="EB Garamond" w:hAnsi="EB Garamond"/>
-          <w:b w:val="0"/>
-          <w:sz w:val="27"/>
-        </w:rPr>
-        <w:t>It was a dangerous sentence, and it was also the sentence of a man who had been trained at a rota and could not, once he had smelled a false balance, leave it alone. The nakhoda, who needed him for the weeks that were left, let him look — not as a right, as a permission that could be taken back.</w:t>
-      </w:r>
-    </w:p>
-    <w:p>
-      <w:pPr>
-        <w:spacing w:line="348" w:lineRule="auto" w:after="0" w:before="0"/>
-        <w:ind w:firstLine="288"/>
-      </w:pPr>
-      <w:r>
-        <w:rPr>
-          <w:rFonts w:ascii="EB Garamond" w:hAnsi="EB Garamond"/>
-          <w:b w:val="0"/>
-          <w:sz w:val="27"/>
-        </w:rPr>
-        <w:t>Khamis looked.</w:t>
-      </w:r>
-    </w:p>
-    <w:p>
-      <w:pPr>
-        <w:spacing w:line="348" w:lineRule="auto" w:after="0" w:before="0"/>
-        <w:ind w:firstLine="288"/>
-      </w:pPr>
-      <w:r>
-        <w:rPr>
-          <w:rFonts w:ascii="EB Garamond" w:hAnsi="EB Garamond"/>
-          <w:b w:val="0"/>
-          <w:sz w:val="27"/>
-        </w:rPr>
-        <w:t>The advances weighed more than the rice the men had eaten. The better pearls of the week were written a grade beneath what the sorting had said aloud. The dead diver's debt had not died with him; it had already begun to lean toward a brother, a cousin, some name that could still be made to carry it. None of this was a secret among men who had worked the banks for thirty years. It was the weather they lived in. But Khamis had come from a well where the rota, kept justly, was the nearest thing that stretch of desert had to a government, and he felt the crookedness of the page the way you feel a floor tilt after you have lived a long time on a level one.</w:t>
-      </w:r>
-    </w:p>
-    <w:p>
-      <w:pPr>
-        <w:spacing w:line="348" w:lineRule="auto" w:after="0" w:before="0"/>
-        <w:ind w:firstLine="288"/>
-      </w:pPr>
-      <w:r>
-        <w:rPr>
-          <w:rFonts w:ascii="EB Garamond" w:hAnsi="EB Garamond"/>
-          <w:b w:val="0"/>
-          <w:sz w:val="27"/>
-        </w:rPr>
-        <w:t>He did the sum. He did it twice. Then he did a third sum that was on no page: what a season's wage would buy him in questions along the coast, set against what a season in this book would cost him in sleep and in the narrow line he was trying to walk between being free and being owed.</w:t>
-      </w:r>
-    </w:p>
-    <w:p>
-      <w:pPr>
-        <w:spacing w:line="348" w:lineRule="auto" w:after="0" w:before="0"/>
-        <w:ind w:firstLine="288"/>
-      </w:pPr>
-      <w:r>
-        <w:rPr>
-          <w:rFonts w:ascii="EB Garamond" w:hAnsi="EB Garamond"/>
-          <w:b w:val="0"/>
-          <w:sz w:val="27"/>
-        </w:rPr>
-        <w:t>"I am finished," he said.</w:t>
-      </w:r>
-    </w:p>
-    <w:p>
-      <w:pPr>
-        <w:spacing w:line="348" w:lineRule="auto" w:after="0" w:before="0"/>
-        <w:ind w:firstLine="288"/>
-      </w:pPr>
-      <w:r>
-        <w:rPr>
-          <w:rFonts w:ascii="EB Garamond" w:hAnsi="EB Garamond"/>
-          <w:b w:val="0"/>
-          <w:sz w:val="27"/>
-        </w:rPr>
-        <w:t>"The season is not finished," said the nakhoda.</w:t>
-      </w:r>
-    </w:p>
-    <w:p>
-      <w:pPr>
-        <w:spacing w:line="348" w:lineRule="auto" w:after="0" w:before="0"/>
-        <w:ind w:firstLine="288"/>
-      </w:pPr>
-      <w:r>
-        <w:rPr>
-          <w:rFonts w:ascii="EB Garamond" w:hAnsi="EB Garamond"/>
-          <w:b w:val="0"/>
-          <w:sz w:val="27"/>
-        </w:rPr>
-        <w:t>"I am," Khamis said. "Pay me what you will admit I am owed. Keep what you have written that I am not. I will not argue the difference on your deck, and I will not dive for it, and I will not pretend your book faces Mecca."</w:t>
-      </w:r>
-    </w:p>
-    <w:p>
-      <w:pPr>
-        <w:spacing w:line="348" w:lineRule="auto" w:after="0" w:before="0"/>
-        <w:ind w:firstLine="288"/>
-      </w:pPr>
-      <w:r>
-        <w:rPr>
-          <w:rFonts w:ascii="EB Garamond" w:hAnsi="EB Garamond"/>
-          <w:b w:val="0"/>
-          <w:sz w:val="27"/>
-        </w:rPr>
-        <w:t>There was a silence of the kind that can turn into a knife. It did not turn. The nakhoda was not a fool, and a free man who can walk away is not a diver who owes. He paid out a portion that was almost fair. Khamis took it, and took his borrowed name and his dark pearl in its cloth and his cold new resolve, and he walked off the boats and did not go back to them, that season or any other.</w:t>
+        <w:t>On the seventh evening the nakhoda had the men open a stubborn set of shells, and among the nothing and the seed-pearls there was one round white that made even the tired divers go quiet. The tawwash's man, aboard that night, turned it in the last light and smiled a small smile and named a grade a full step below what every eye on the deck had seen.</w:t>
+      </w:r>
+    </w:p>
+    <w:p>
+      <w:pPr>
+        <w:spacing w:line="348" w:lineRule="auto" w:after="0" w:before="0"/>
+        <w:ind w:firstLine="288"/>
+      </w:pPr>
+      <w:r>
+        <w:rPr>
+          <w:rFonts w:ascii="EB Garamond" w:hAnsi="EB Garamond"/>
+          <w:b w:val="0"/>
+          <w:sz w:val="27"/>
+        </w:rPr>
+        <w:t>Later Khamis said to the diver who had brought it up, privately, "Say what you saw."</w:t>
+      </w:r>
+    </w:p>
+    <w:p>
+      <w:pPr>
+        <w:spacing w:line="348" w:lineRule="auto" w:after="0" w:before="0"/>
+        <w:ind w:firstLine="288"/>
+      </w:pPr>
+      <w:r>
+        <w:rPr>
+          <w:rFonts w:ascii="EB Garamond" w:hAnsi="EB Garamond"/>
+          <w:b w:val="0"/>
+          <w:sz w:val="27"/>
+        </w:rPr>
+        <w:t>"I saw a better pearl," the diver said.</w:t>
+      </w:r>
+    </w:p>
+    <w:p>
+      <w:pPr>
+        <w:spacing w:line="348" w:lineRule="auto" w:after="0" w:before="0"/>
+        <w:ind w:firstLine="288"/>
+      </w:pPr>
+      <w:r>
+        <w:rPr>
+          <w:rFonts w:ascii="EB Garamond" w:hAnsi="EB Garamond"/>
+          <w:b w:val="0"/>
+          <w:sz w:val="27"/>
+        </w:rPr>
+        <w:t>"And now?"</w:t>
+      </w:r>
+    </w:p>
+    <w:p>
+      <w:pPr>
+        <w:spacing w:line="348" w:lineRule="auto" w:after="0" w:before="0"/>
+        <w:ind w:firstLine="288"/>
+      </w:pPr>
+      <w:r>
+        <w:rPr>
+          <w:rFonts w:ascii="EB Garamond" w:hAnsi="EB Garamond"/>
+          <w:b w:val="0"/>
+          <w:sz w:val="27"/>
+        </w:rPr>
+        <w:t>"Now I see what I am permitted to see."</w:t>
+      </w:r>
+    </w:p>
+    <w:p>
+      <w:pPr>
+        <w:spacing w:line="348" w:lineRule="auto" w:after="0" w:before="0"/>
+        <w:ind w:firstLine="288"/>
+      </w:pPr>
+      <w:r>
+        <w:rPr>
+          <w:rFonts w:ascii="EB Garamond" w:hAnsi="EB Garamond"/>
+          <w:b w:val="0"/>
+          <w:sz w:val="27"/>
+        </w:rPr>
+        <w:t>Khamis did not sleep well. He lay counting the distance between a thing and its written shadow, and when at last he slept he dreamed of Yaqut asking whether there would be a mother where they were going, and he woke with the old kind answer still in his mouth, unspent.</w:t>
       </w:r>
     </w:p>
     <w:p>
@@ -4657,119 +4517,231 @@
           <w:b w:val="0"/>
           <w:sz w:val="27"/>
         </w:rPr>
-        <w:t>The resolve was a plain one, and he kept it the rest of a long life: never again to let another man hold the only copy of a number that could own him. If he traded, he would keep his own tally. If he trusted, he would trust before a witness. If a page was ever handed to him as a mercy, he would read it as a tool.</w:t>
-      </w:r>
-    </w:p>
-    <w:p>
-      <w:pPr>
-        <w:spacing w:line="348" w:lineRule="auto" w:after="0" w:before="0"/>
-        <w:ind w:firstLine="288"/>
-      </w:pPr>
-      <w:r>
-        <w:rPr>
-          <w:rFonts w:ascii="EB Garamond" w:hAnsi="EB Garamond"/>
-          <w:b w:val="0"/>
-          <w:sz w:val="27"/>
-        </w:rPr>
-        <w:t>He walked inland thinner and quieter, carrying silver that was less than an honest season's wage and more than a season's peace. At a coffee-fire in a town behind the coast a man was complaining that Bombay had known yesterday's pearl price before the local tawwash had finished his morning cup — the wire again, working under the same water that drowned the diver, a rope that pulled prices faster than any dhow could pull a living man.</w:t>
-      </w:r>
-    </w:p>
-    <w:p>
-      <w:pPr>
-        <w:spacing w:line="348" w:lineRule="auto" w:after="0" w:before="0"/>
-        <w:ind w:firstLine="288"/>
-      </w:pPr>
-      <w:r>
-        <w:rPr>
-          <w:rFonts w:ascii="EB Garamond" w:hAnsi="EB Garamond"/>
-          <w:b w:val="0"/>
-          <w:sz w:val="27"/>
-        </w:rPr>
-        <w:t>"That will finish us," the man said.</w:t>
-      </w:r>
-    </w:p>
-    <w:p>
-      <w:pPr>
-        <w:spacing w:line="348" w:lineRule="auto" w:after="0" w:before="0"/>
-        <w:ind w:firstLine="288"/>
-      </w:pPr>
-      <w:r>
-        <w:rPr>
-          <w:rFonts w:ascii="EB Garamond" w:hAnsi="EB Garamond"/>
-          <w:b w:val="0"/>
-          <w:sz w:val="27"/>
-        </w:rPr>
-        <w:t>"Or finish only the ones who cannot read," said another.</w:t>
-      </w:r>
-    </w:p>
-    <w:p>
-      <w:pPr>
-        <w:spacing w:line="348" w:lineRule="auto" w:after="0" w:before="0"/>
-        <w:ind w:firstLine="288"/>
-      </w:pPr>
-      <w:r>
-        <w:rPr>
-          <w:rFonts w:ascii="EB Garamond" w:hAnsi="EB Garamond"/>
-          <w:b w:val="0"/>
-          <w:sz w:val="27"/>
-        </w:rPr>
-        <w:t>Khamis did not join the talk. He listened, and filed it, and understood a thing his own great-grandchildren would live inside: that the future would arrive along the water, by machine, carrying words and prices and, in the end, men — and that a family that meant to survive it had better keep its own books tighter than the wire could pry, and trust nothing it could not itself prove.</w:t>
-      </w:r>
-    </w:p>
-    <w:p>
-      <w:pPr>
-        <w:spacing w:line="348" w:lineRule="auto" w:after="0" w:before="0"/>
-        <w:ind w:firstLine="288"/>
-      </w:pPr>
-      <w:r>
-        <w:rPr>
-          <w:rFonts w:ascii="EB Garamond" w:hAnsi="EB Garamond"/>
-          <w:b w:val="0"/>
-          <w:sz w:val="27"/>
-        </w:rPr>
-        <w:t>A coast scribe, hearing he had left a good boat, offered to write him a contract of return "in case you reconsider."</w:t>
-      </w:r>
-    </w:p>
-    <w:p>
-      <w:pPr>
-        <w:spacing w:line="348" w:lineRule="auto" w:after="0" w:before="0"/>
-        <w:ind w:firstLine="288"/>
-      </w:pPr>
-      <w:r>
-        <w:rPr>
-          <w:rFonts w:ascii="EB Garamond" w:hAnsi="EB Garamond"/>
-          <w:b w:val="0"/>
-          <w:sz w:val="27"/>
-        </w:rPr>
-        <w:t>"I do not reconsider a book that eats men," Khamis said.</w:t>
-      </w:r>
-    </w:p>
-    <w:p>
-      <w:pPr>
-        <w:spacing w:line="348" w:lineRule="auto" w:after="0" w:before="0"/>
-        <w:ind w:firstLine="288"/>
-      </w:pPr>
-      <w:r>
-        <w:rPr>
-          <w:rFonts w:ascii="EB Garamond" w:hAnsi="EB Garamond"/>
-          <w:b w:val="0"/>
-          <w:sz w:val="27"/>
-        </w:rPr>
-        <w:t>The scribe shrugged. "Then you will be poor and free, which is a joke God enjoys."</w:t>
-      </w:r>
-    </w:p>
-    <w:p>
-      <w:pPr>
-        <w:spacing w:line="348" w:lineRule="auto" w:after="0" w:before="0"/>
-        <w:ind w:firstLine="288"/>
-      </w:pPr>
-      <w:r>
-        <w:rPr>
-          <w:rFonts w:ascii="EB Garamond" w:hAnsi="EB Garamond"/>
-          <w:b w:val="0"/>
-          <w:sz w:val="27"/>
-        </w:rPr>
-        <w:t>"I have heard worse jokes," Khamis said, and paid for the coffee, and left the joke on the mat.</w:t>
+        <w:t>Then the good week broke.</w:t>
+      </w:r>
+    </w:p>
+    <w:p>
+      <w:pPr>
+        <w:spacing w:line="348" w:lineRule="auto" w:after="0" w:before="0"/>
+        <w:ind w:firstLine="288"/>
+      </w:pPr>
+      <w:r>
+        <w:rPr>
+          <w:rFonts w:ascii="EB Garamond" w:hAnsi="EB Garamond"/>
+          <w:b w:val="0"/>
+          <w:sz w:val="27"/>
+        </w:rPr>
+        <w:t>A diver went down on his own rope — the phrase the men used, which meant the stone and the breath and the bottom and the moment the pull did not come when it should have come. They hauled. What came up was not a man who could gasp and go again. The sea had finished with him in the middle of a sentence of work, the way the sea finished with men, without a speech and without a warning.</w:t>
+      </w:r>
+    </w:p>
+    <w:p>
+      <w:pPr>
+        <w:spacing w:line="348" w:lineRule="auto" w:after="0" w:before="0"/>
+        <w:ind w:firstLine="288"/>
+      </w:pPr>
+      <w:r>
+        <w:rPr>
+          <w:rFonts w:ascii="EB Garamond" w:hAnsi="EB Garamond"/>
+          <w:b w:val="0"/>
+          <w:sz w:val="27"/>
+        </w:rPr>
+        <w:t>They did what boats do. They covered him. They said the words over him. And then, before the sun had moved far, they reckoned how the day's catch and the dead man's debt would be entered, because a body that dies still leaves numbers behind it, and numbers do not pause for grief.</w:t>
+      </w:r>
+    </w:p>
+    <w:p>
+      <w:pPr>
+        <w:spacing w:line="348" w:lineRule="auto" w:after="0" w:before="0"/>
+        <w:ind w:firstLine="288"/>
+      </w:pPr>
+      <w:r>
+        <w:rPr>
+          <w:rFonts w:ascii="EB Garamond" w:hAnsi="EB Garamond"/>
+          <w:b w:val="0"/>
+          <w:sz w:val="27"/>
+        </w:rPr>
+        <w:t>"Write him clean," said one of the older divers, meaning: do not load his brother with a debt you have invented.</w:t>
+      </w:r>
+    </w:p>
+    <w:p>
+      <w:pPr>
+        <w:spacing w:line="348" w:lineRule="auto" w:after="0" w:before="0"/>
+        <w:ind w:firstLine="288"/>
+      </w:pPr>
+      <w:r>
+        <w:rPr>
+          <w:rFonts w:ascii="EB Garamond" w:hAnsi="EB Garamond"/>
+          <w:b w:val="0"/>
+          <w:sz w:val="27"/>
+        </w:rPr>
+        <w:t>"We write what is owed," the nakhoda said.</w:t>
+      </w:r>
+    </w:p>
+    <w:p>
+      <w:pPr>
+        <w:spacing w:line="348" w:lineRule="auto" w:after="0" w:before="0"/>
+        <w:ind w:firstLine="288"/>
+      </w:pPr>
+      <w:r>
+        <w:rPr>
+          <w:rFonts w:ascii="EB Garamond" w:hAnsi="EB Garamond"/>
+          <w:b w:val="0"/>
+          <w:sz w:val="27"/>
+        </w:rPr>
+        <w:t>Khamis heard both sentences and felt the old coldness from the dhow's hold — the arithmetic of persons — come up the rope with the corpse and sit down among the living.</w:t>
+      </w:r>
+    </w:p>
+    <w:p>
+      <w:pPr>
+        <w:spacing w:line="348" w:lineRule="auto" w:after="0" w:before="0"/>
+        <w:ind w:firstLine="288"/>
+      </w:pPr>
+      <w:r>
+        <w:rPr>
+          <w:rFonts w:ascii="EB Garamond" w:hAnsi="EB Garamond"/>
+          <w:b w:val="0"/>
+          <w:sz w:val="27"/>
+        </w:rPr>
+        <w:t>That night he asked to see the book.</w:t>
+      </w:r>
+    </w:p>
+    <w:p>
+      <w:pPr>
+        <w:spacing w:line="348" w:lineRule="auto" w:after="0" w:before="0"/>
+        <w:ind w:firstLine="288"/>
+      </w:pPr>
+      <w:r>
+        <w:rPr>
+          <w:rFonts w:ascii="EB Garamond" w:hAnsi="EB Garamond"/>
+          <w:b w:val="0"/>
+          <w:sz w:val="27"/>
+        </w:rPr>
+        <w:t>The nakhoda laughed. "You are not the owner."</w:t>
+      </w:r>
+    </w:p>
+    <w:p>
+      <w:pPr>
+        <w:spacing w:line="348" w:lineRule="auto" w:after="0" w:before="0"/>
+        <w:ind w:firstLine="288"/>
+      </w:pPr>
+      <w:r>
+        <w:rPr>
+          <w:rFonts w:ascii="EB Garamond" w:hAnsi="EB Garamond"/>
+          <w:b w:val="0"/>
+          <w:sz w:val="27"/>
+        </w:rPr>
+        <w:t>"I am the man who has been keeping your numbers in his head all season," Khamis said. "I would only like to see whether your page and my head agree."</w:t>
+      </w:r>
+    </w:p>
+    <w:p>
+      <w:pPr>
+        <w:spacing w:line="348" w:lineRule="auto" w:after="0" w:before="0"/>
+        <w:ind w:firstLine="288"/>
+      </w:pPr>
+      <w:r>
+        <w:rPr>
+          <w:rFonts w:ascii="EB Garamond" w:hAnsi="EB Garamond"/>
+          <w:b w:val="0"/>
+          <w:sz w:val="27"/>
+        </w:rPr>
+        <w:t>It was a dangerous sentence, and it was also the sentence of a man who had been trained at a rota and could not, once he had smelled a false balance, leave it alone. The nakhoda, who needed him for the weeks that were left, let him look — not as a right, as a permission that could be taken back.</w:t>
+      </w:r>
+    </w:p>
+    <w:p>
+      <w:pPr>
+        <w:spacing w:line="348" w:lineRule="auto" w:after="0" w:before="0"/>
+        <w:ind w:firstLine="288"/>
+      </w:pPr>
+      <w:r>
+        <w:rPr>
+          <w:rFonts w:ascii="EB Garamond" w:hAnsi="EB Garamond"/>
+          <w:b w:val="0"/>
+          <w:sz w:val="27"/>
+        </w:rPr>
+        <w:t>Khamis looked.</w:t>
+      </w:r>
+    </w:p>
+    <w:p>
+      <w:pPr>
+        <w:spacing w:line="348" w:lineRule="auto" w:after="0" w:before="0"/>
+        <w:ind w:firstLine="288"/>
+      </w:pPr>
+      <w:r>
+        <w:rPr>
+          <w:rFonts w:ascii="EB Garamond" w:hAnsi="EB Garamond"/>
+          <w:b w:val="0"/>
+          <w:sz w:val="27"/>
+        </w:rPr>
+        <w:t>The advances weighed more than the rice the men had eaten. The better pearls of the week were written a grade beneath what the sorting had said aloud. The dead diver's debt had not died with him; it had already begun to lean toward a brother, a cousin, some name that could still be made to carry it. None of this was a secret among men who had worked the banks for thirty years. It was the weather they lived in. But Khamis had come from a well where the rota, kept justly, was the nearest thing that stretch of desert had to a government, and he felt the crookedness of the page the way you feel a floor tilt after you have lived a long time on a level one.</w:t>
+      </w:r>
+    </w:p>
+    <w:p>
+      <w:pPr>
+        <w:spacing w:line="348" w:lineRule="auto" w:after="0" w:before="0"/>
+        <w:ind w:firstLine="288"/>
+      </w:pPr>
+      <w:r>
+        <w:rPr>
+          <w:rFonts w:ascii="EB Garamond" w:hAnsi="EB Garamond"/>
+          <w:b w:val="0"/>
+          <w:sz w:val="27"/>
+        </w:rPr>
+        <w:t>He did the sum. He did it twice. Then he did a third sum that was on no page: what a season's wage would buy him in questions along the coast, set against what a season in this book would cost him in sleep and in the narrow line he was trying to walk between being free and being owed.</w:t>
+      </w:r>
+    </w:p>
+    <w:p>
+      <w:pPr>
+        <w:spacing w:line="348" w:lineRule="auto" w:after="0" w:before="0"/>
+        <w:ind w:firstLine="288"/>
+      </w:pPr>
+      <w:r>
+        <w:rPr>
+          <w:rFonts w:ascii="EB Garamond" w:hAnsi="EB Garamond"/>
+          <w:b w:val="0"/>
+          <w:sz w:val="27"/>
+        </w:rPr>
+        <w:t>"I am finished," he said.</w:t>
+      </w:r>
+    </w:p>
+    <w:p>
+      <w:pPr>
+        <w:spacing w:line="348" w:lineRule="auto" w:after="0" w:before="0"/>
+        <w:ind w:firstLine="288"/>
+      </w:pPr>
+      <w:r>
+        <w:rPr>
+          <w:rFonts w:ascii="EB Garamond" w:hAnsi="EB Garamond"/>
+          <w:b w:val="0"/>
+          <w:sz w:val="27"/>
+        </w:rPr>
+        <w:t>"The season is not finished," said the nakhoda.</w:t>
+      </w:r>
+    </w:p>
+    <w:p>
+      <w:pPr>
+        <w:spacing w:line="348" w:lineRule="auto" w:after="0" w:before="0"/>
+        <w:ind w:firstLine="288"/>
+      </w:pPr>
+      <w:r>
+        <w:rPr>
+          <w:rFonts w:ascii="EB Garamond" w:hAnsi="EB Garamond"/>
+          <w:b w:val="0"/>
+          <w:sz w:val="27"/>
+        </w:rPr>
+        <w:t>"I am," Khamis said. "Pay me what you will admit I am owed. Keep what you have written that I am not. I will not argue the difference on your deck, and I will not dive for it, and I will not pretend your book faces Mecca."</w:t>
+      </w:r>
+    </w:p>
+    <w:p>
+      <w:pPr>
+        <w:spacing w:line="348" w:lineRule="auto" w:after="0" w:before="0"/>
+        <w:ind w:firstLine="288"/>
+      </w:pPr>
+      <w:r>
+        <w:rPr>
+          <w:rFonts w:ascii="EB Garamond" w:hAnsi="EB Garamond"/>
+          <w:b w:val="0"/>
+          <w:sz w:val="27"/>
+        </w:rPr>
+        <w:t>There was a silence of the kind that can turn into a knife. It did not turn. The nakhoda was not a fool, and a free man who can walk away is not a diver who owes. He paid out a portion that was almost fair. Khamis took it, and took his borrowed name and his dark pearl in its cloth and his cold new resolve, and he walked off the boats and did not go back to them, that season or any other.</w:t>
       </w:r>
     </w:p>
     <w:p>
@@ -4798,160 +4770,119 @@
           <w:b w:val="0"/>
           <w:sz w:val="27"/>
         </w:rPr>
-        <w:t>Wadha fed him when he came home, because that was the other half of the marriage they were building: he went out and came back with little, and she stayed and governed the kitchen and fed the little he came back with, and neither of those was the smaller work. She did not ask whether he had found her sister. He told her, after bread, that he had found a kind of answer about the years and the age, and that it was not the answer either of them wanted.</w:t>
-      </w:r>
-    </w:p>
-    <w:p>
-      <w:pPr>
-        <w:spacing w:line="348" w:lineRule="auto" w:after="0" w:before="0"/>
-        <w:ind w:firstLine="288"/>
-      </w:pPr>
-      <w:r>
-        <w:rPr>
-          <w:rFonts w:ascii="EB Garamond" w:hAnsi="EB Garamond"/>
-          <w:b w:val="0"/>
-          <w:sz w:val="27"/>
-        </w:rPr>
-        <w:t>"And the boats?" she said.</w:t>
-      </w:r>
-    </w:p>
-    <w:p>
-      <w:pPr>
-        <w:spacing w:line="348" w:lineRule="auto" w:after="0" w:before="0"/>
-        <w:ind w:firstLine="288"/>
-      </w:pPr>
-      <w:r>
-        <w:rPr>
-          <w:rFonts w:ascii="EB Garamond" w:hAnsi="EB Garamond"/>
-          <w:b w:val="0"/>
-          <w:sz w:val="27"/>
-        </w:rPr>
-        <w:t>"Finished," he said.</w:t>
-      </w:r>
-    </w:p>
-    <w:p>
-      <w:pPr>
-        <w:spacing w:line="348" w:lineRule="auto" w:after="0" w:before="0"/>
-        <w:ind w:firstLine="288"/>
-      </w:pPr>
-      <w:r>
-        <w:rPr>
-          <w:rFonts w:ascii="EB Garamond" w:hAnsi="EB Garamond"/>
-          <w:b w:val="0"/>
-          <w:sz w:val="27"/>
-        </w:rPr>
-        <w:t>She nodded as though he had told her the rota for the week. In the dark, later, she touched the place on his neck where the sun had burned him on the deck, and neither of them named the drowned man, and the silence was not empty. It was a ledger of its own.</w:t>
-      </w:r>
-    </w:p>
-    <w:p>
-      <w:pPr>
-        <w:spacing w:line="348" w:lineRule="auto" w:after="0" w:before="0"/>
-        <w:ind w:firstLine="288"/>
-      </w:pPr>
-      <w:r>
-        <w:rPr>
-          <w:rFonts w:ascii="EB Garamond" w:hAnsi="EB Garamond"/>
-          <w:b w:val="0"/>
-          <w:sz w:val="27"/>
-        </w:rPr>
-        <w:t>Talal asked only, "Did you learn?"</w:t>
-      </w:r>
-    </w:p>
-    <w:p>
-      <w:pPr>
-        <w:spacing w:line="348" w:lineRule="auto" w:after="0" w:before="0"/>
-        <w:ind w:firstLine="288"/>
-      </w:pPr>
-      <w:r>
-        <w:rPr>
-          <w:rFonts w:ascii="EB Garamond" w:hAnsi="EB Garamond"/>
-          <w:b w:val="0"/>
-          <w:sz w:val="27"/>
-        </w:rPr>
-        <w:t>"I learned," Khamis said.</w:t>
-      </w:r>
-    </w:p>
-    <w:p>
-      <w:pPr>
-        <w:spacing w:line="348" w:lineRule="auto" w:after="0" w:before="0"/>
-        <w:ind w:firstLine="288"/>
-      </w:pPr>
-      <w:r>
-        <w:rPr>
-          <w:rFonts w:ascii="EB Garamond" w:hAnsi="EB Garamond"/>
-          <w:b w:val="0"/>
-          <w:sz w:val="27"/>
-        </w:rPr>
-        <w:t>"Will you go again?"</w:t>
-      </w:r>
-    </w:p>
-    <w:p>
-      <w:pPr>
-        <w:spacing w:line="348" w:lineRule="auto" w:after="0" w:before="0"/>
-        <w:ind w:firstLine="288"/>
-      </w:pPr>
-      <w:r>
-        <w:rPr>
-          <w:rFonts w:ascii="EB Garamond" w:hAnsi="EB Garamond"/>
-          <w:b w:val="0"/>
-          <w:sz w:val="27"/>
-        </w:rPr>
-        <w:t>"Not to dive. Not to haul. Not to pretend a crooked book is straight. If I go, I go to ask, and I keep my own count."</w:t>
-      </w:r>
-    </w:p>
-    <w:p>
-      <w:pPr>
-        <w:spacing w:line="348" w:lineRule="auto" w:after="0" w:before="0"/>
-        <w:ind w:firstLine="288"/>
-      </w:pPr>
-      <w:r>
-        <w:rPr>
-          <w:rFonts w:ascii="EB Garamond" w:hAnsi="EB Garamond"/>
-          <w:b w:val="0"/>
-          <w:sz w:val="27"/>
-        </w:rPr>
-        <w:t>"Then the summer was not wasted," Talal said.</w:t>
-      </w:r>
-    </w:p>
-    <w:p>
-      <w:pPr>
-        <w:spacing w:line="348" w:lineRule="auto" w:after="0" w:before="0"/>
-        <w:ind w:firstLine="288"/>
-      </w:pPr>
-      <w:r>
-        <w:rPr>
-          <w:rFonts w:ascii="EB Garamond" w:hAnsi="EB Garamond"/>
-          <w:b w:val="0"/>
-          <w:sz w:val="27"/>
-        </w:rPr>
-        <w:t>Fahd heard the coast in the report — the smell of it, the rope, the silence a man makes when the haul does not answer — and went quiet in the old way, and said, after a while, "When the century comes for the banks, you will remember the sound of the pull stopping."</w:t>
-      </w:r>
-    </w:p>
-    <w:p>
-      <w:pPr>
-        <w:spacing w:line="348" w:lineRule="auto" w:after="0" w:before="0"/>
-        <w:ind w:firstLine="288"/>
-      </w:pPr>
-      <w:r>
-        <w:rPr>
-          <w:rFonts w:ascii="EB Garamond" w:hAnsi="EB Garamond"/>
-          <w:b w:val="0"/>
-          <w:sz w:val="27"/>
-        </w:rPr>
-        <w:t>"I already remember it," Khamis said, and the dark pearl in its cloth knocked once against his chest as he leaned to drink, as if to remind him that kindness and superstition and ruin could all three be carried in a single small weight.</w:t>
-      </w:r>
-    </w:p>
-    <w:p>
-      <w:pPr>
-        <w:spacing w:line="348" w:lineRule="auto" w:after="0" w:before="0"/>
-        <w:ind w:firstLine="288"/>
-      </w:pPr>
-      <w:r>
-        <w:rPr>
-          <w:rFonts w:ascii="EB Garamond" w:hAnsi="EB Garamond"/>
-          <w:b w:val="0"/>
-          <w:sz w:val="27"/>
-        </w:rPr>
+        <w:t>The resolve was a plain one, and he kept it the rest of a long life: never again to let another man hold the only copy of a number that could own him. If he traded, he would keep his own tally. If he trusted, he would trust before a witness. If a page was ever handed to him as a mercy, he would read it as a tool.</w:t>
+      </w:r>
+    </w:p>
+    <w:p>
+      <w:pPr>
+        <w:spacing w:line="348" w:lineRule="auto" w:after="0" w:before="0"/>
+        <w:ind w:firstLine="288"/>
+      </w:pPr>
+      <w:r>
+        <w:rPr>
+          <w:rFonts w:ascii="EB Garamond" w:hAnsi="EB Garamond"/>
+          <w:b w:val="0"/>
+          <w:sz w:val="27"/>
+        </w:rPr>
+        <w:t>He walked inland thinner and quieter, carrying silver that was less than an honest season's wage and more than a season's peace. At a coffee-fire in a town behind the coast a man was complaining that Bombay had known yesterday's pearl price before the local tawwash had finished his morning cup — the wire again, working under the same water that drowned the diver, a rope that pulled prices faster than any dhow could pull a living man.</w:t>
+      </w:r>
+    </w:p>
+    <w:p>
+      <w:pPr>
+        <w:spacing w:line="348" w:lineRule="auto" w:after="0" w:before="0"/>
+        <w:ind w:firstLine="288"/>
+      </w:pPr>
+      <w:r>
+        <w:rPr>
+          <w:rFonts w:ascii="EB Garamond" w:hAnsi="EB Garamond"/>
+          <w:b w:val="0"/>
+          <w:sz w:val="27"/>
+        </w:rPr>
+        <w:t>"That will finish us," the man said.</w:t>
+      </w:r>
+    </w:p>
+    <w:p>
+      <w:pPr>
+        <w:spacing w:line="348" w:lineRule="auto" w:after="0" w:before="0"/>
+        <w:ind w:firstLine="288"/>
+      </w:pPr>
+      <w:r>
+        <w:rPr>
+          <w:rFonts w:ascii="EB Garamond" w:hAnsi="EB Garamond"/>
+          <w:b w:val="0"/>
+          <w:sz w:val="27"/>
+        </w:rPr>
+        <w:t>"Or finish only the ones who cannot read," said another.</w:t>
+      </w:r>
+    </w:p>
+    <w:p>
+      <w:pPr>
+        <w:spacing w:line="348" w:lineRule="auto" w:after="0" w:before="0"/>
+        <w:ind w:firstLine="288"/>
+      </w:pPr>
+      <w:r>
+        <w:rPr>
+          <w:rFonts w:ascii="EB Garamond" w:hAnsi="EB Garamond"/>
+          <w:b w:val="0"/>
+          <w:sz w:val="27"/>
+        </w:rPr>
+        <w:t>Khamis did not join the talk. He listened, and filed it, and understood a thing his own great-grandchildren would live inside: that the future would arrive along the water, by machine, carrying words and prices and, in the end, men — and that a family that meant to survive it had better keep its own books tighter than the wire could pry, and trust nothing it could not itself prove.</w:t>
+      </w:r>
+    </w:p>
+    <w:p>
+      <w:pPr>
+        <w:spacing w:line="348" w:lineRule="auto" w:after="0" w:before="0"/>
+        <w:ind w:firstLine="288"/>
+      </w:pPr>
+      <w:r>
+        <w:rPr>
+          <w:rFonts w:ascii="EB Garamond" w:hAnsi="EB Garamond"/>
+          <w:b w:val="0"/>
+          <w:sz w:val="27"/>
+        </w:rPr>
+        <w:t>A coast scribe, hearing he had left a good boat, offered to write him a contract of return "in case you reconsider."</w:t>
+      </w:r>
+    </w:p>
+    <w:p>
+      <w:pPr>
+        <w:spacing w:line="348" w:lineRule="auto" w:after="0" w:before="0"/>
+        <w:ind w:firstLine="288"/>
+      </w:pPr>
+      <w:r>
+        <w:rPr>
+          <w:rFonts w:ascii="EB Garamond" w:hAnsi="EB Garamond"/>
+          <w:b w:val="0"/>
+          <w:sz w:val="27"/>
+        </w:rPr>
+        <w:t>"I do not reconsider a book that eats men," Khamis said.</w:t>
+      </w:r>
+    </w:p>
+    <w:p>
+      <w:pPr>
+        <w:spacing w:line="348" w:lineRule="auto" w:after="0" w:before="0"/>
+        <w:ind w:firstLine="288"/>
+      </w:pPr>
+      <w:r>
+        <w:rPr>
+          <w:rFonts w:ascii="EB Garamond" w:hAnsi="EB Garamond"/>
+          <w:b w:val="0"/>
+          <w:sz w:val="27"/>
+        </w:rPr>
+        <w:t>The scribe shrugged. "Then you will be poor and free, which is a joke God enjoys."</w:t>
+      </w:r>
+    </w:p>
+    <w:p>
+      <w:pPr>
+        <w:spacing w:line="348" w:lineRule="auto" w:after="0" w:before="0"/>
+        <w:ind w:firstLine="288"/>
+      </w:pPr>
+      <w:r>
+        <w:rPr>
+          <w:rFonts w:ascii="EB Garamond" w:hAnsi="EB Garamond"/>
+          <w:b w:val="0"/>
+          <w:sz w:val="27"/>
+        </w:rPr>
+        <w:t>"I have heard worse jokes," Khamis said, and paid for the coffee, and left the joke on the mat.</w:t>
       </w:r>
     </w:p>
     <w:p>
@@ -4963,6 +4894,188 @@
       <w:r>
         <w:rPr>
           <w:rFonts w:ascii="EB Garamond" w:hAnsi="EB Garamond"/>
+          <w:b w:val="0"/>
+          <w:sz w:val="27"/>
+        </w:rPr>
+        <w:t>❦</w:t>
+      </w:r>
+    </w:p>
+    <w:p>
+      <w:pPr>
+        <w:spacing w:line="348" w:lineRule="auto" w:after="0" w:before="0"/>
+        <w:ind w:firstLine="0"/>
+      </w:pPr>
+      <w:r>
+        <w:rPr>
+          <w:rFonts w:ascii="EB Garamond" w:hAnsi="EB Garamond"/>
+          <w:b w:val="0"/>
+          <w:sz w:val="27"/>
+        </w:rPr>
+        <w:t>Wadha fed him when he came home, because that was the other half of the marriage they were building: he went out and came back with little, and she stayed and governed the kitchen and fed the little he came back with, and neither of those was the smaller work. She did not ask whether he had found her sister. He told her, after bread, that he had found a kind of answer about the years and the age, and that it was not the answer either of them wanted.</w:t>
+      </w:r>
+    </w:p>
+    <w:p>
+      <w:pPr>
+        <w:spacing w:line="348" w:lineRule="auto" w:after="0" w:before="0"/>
+        <w:ind w:firstLine="288"/>
+      </w:pPr>
+      <w:r>
+        <w:rPr>
+          <w:rFonts w:ascii="EB Garamond" w:hAnsi="EB Garamond"/>
+          <w:b w:val="0"/>
+          <w:sz w:val="27"/>
+        </w:rPr>
+        <w:t>"And the boats?" she said.</w:t>
+      </w:r>
+    </w:p>
+    <w:p>
+      <w:pPr>
+        <w:spacing w:line="348" w:lineRule="auto" w:after="0" w:before="0"/>
+        <w:ind w:firstLine="288"/>
+      </w:pPr>
+      <w:r>
+        <w:rPr>
+          <w:rFonts w:ascii="EB Garamond" w:hAnsi="EB Garamond"/>
+          <w:b w:val="0"/>
+          <w:sz w:val="27"/>
+        </w:rPr>
+        <w:t>"Finished," he said.</w:t>
+      </w:r>
+    </w:p>
+    <w:p>
+      <w:pPr>
+        <w:spacing w:line="348" w:lineRule="auto" w:after="0" w:before="0"/>
+        <w:ind w:firstLine="288"/>
+      </w:pPr>
+      <w:r>
+        <w:rPr>
+          <w:rFonts w:ascii="EB Garamond" w:hAnsi="EB Garamond"/>
+          <w:b w:val="0"/>
+          <w:sz w:val="27"/>
+        </w:rPr>
+        <w:t>She nodded as though he had told her the rota for the week. In the dark, later, she touched the place on his neck where the sun had burned him on the deck, and neither of them named the drowned man, and the silence was not empty. It was a ledger of its own.</w:t>
+      </w:r>
+    </w:p>
+    <w:p>
+      <w:pPr>
+        <w:spacing w:line="348" w:lineRule="auto" w:after="0" w:before="0"/>
+        <w:ind w:firstLine="288"/>
+      </w:pPr>
+      <w:r>
+        <w:rPr>
+          <w:rFonts w:ascii="EB Garamond" w:hAnsi="EB Garamond"/>
+          <w:b w:val="0"/>
+          <w:sz w:val="27"/>
+        </w:rPr>
+        <w:t>Talal asked only, "Did you learn?"</w:t>
+      </w:r>
+    </w:p>
+    <w:p>
+      <w:pPr>
+        <w:spacing w:line="348" w:lineRule="auto" w:after="0" w:before="0"/>
+        <w:ind w:firstLine="288"/>
+      </w:pPr>
+      <w:r>
+        <w:rPr>
+          <w:rFonts w:ascii="EB Garamond" w:hAnsi="EB Garamond"/>
+          <w:b w:val="0"/>
+          <w:sz w:val="27"/>
+        </w:rPr>
+        <w:t>"I learned," Khamis said.</w:t>
+      </w:r>
+    </w:p>
+    <w:p>
+      <w:pPr>
+        <w:spacing w:line="348" w:lineRule="auto" w:after="0" w:before="0"/>
+        <w:ind w:firstLine="288"/>
+      </w:pPr>
+      <w:r>
+        <w:rPr>
+          <w:rFonts w:ascii="EB Garamond" w:hAnsi="EB Garamond"/>
+          <w:b w:val="0"/>
+          <w:sz w:val="27"/>
+        </w:rPr>
+        <w:t>"Will you go again?"</w:t>
+      </w:r>
+    </w:p>
+    <w:p>
+      <w:pPr>
+        <w:spacing w:line="348" w:lineRule="auto" w:after="0" w:before="0"/>
+        <w:ind w:firstLine="288"/>
+      </w:pPr>
+      <w:r>
+        <w:rPr>
+          <w:rFonts w:ascii="EB Garamond" w:hAnsi="EB Garamond"/>
+          <w:b w:val="0"/>
+          <w:sz w:val="27"/>
+        </w:rPr>
+        <w:t>"Not to dive. Not to haul. Not to pretend a crooked book is straight. If I go, I go to ask, and I keep my own count."</w:t>
+      </w:r>
+    </w:p>
+    <w:p>
+      <w:pPr>
+        <w:spacing w:line="348" w:lineRule="auto" w:after="0" w:before="0"/>
+        <w:ind w:firstLine="288"/>
+      </w:pPr>
+      <w:r>
+        <w:rPr>
+          <w:rFonts w:ascii="EB Garamond" w:hAnsi="EB Garamond"/>
+          <w:b w:val="0"/>
+          <w:sz w:val="27"/>
+        </w:rPr>
+        <w:t>"Then the summer was not wasted," Talal said.</w:t>
+      </w:r>
+    </w:p>
+    <w:p>
+      <w:pPr>
+        <w:spacing w:line="348" w:lineRule="auto" w:after="0" w:before="0"/>
+        <w:ind w:firstLine="288"/>
+      </w:pPr>
+      <w:r>
+        <w:rPr>
+          <w:rFonts w:ascii="EB Garamond" w:hAnsi="EB Garamond"/>
+          <w:b w:val="0"/>
+          <w:sz w:val="27"/>
+        </w:rPr>
+        <w:t>Fahd heard the coast in the report — the smell of it, the rope, the silence a man makes when the haul does not answer — and went quiet in the old way, and said, after a while, "When the century comes for the banks, you will remember the sound of the pull stopping."</w:t>
+      </w:r>
+    </w:p>
+    <w:p>
+      <w:pPr>
+        <w:spacing w:line="348" w:lineRule="auto" w:after="0" w:before="0"/>
+        <w:ind w:firstLine="288"/>
+      </w:pPr>
+      <w:r>
+        <w:rPr>
+          <w:rFonts w:ascii="EB Garamond" w:hAnsi="EB Garamond"/>
+          <w:b w:val="0"/>
+          <w:sz w:val="27"/>
+        </w:rPr>
+        <w:t>"I already remember it," Khamis said, and the dark pearl in its cloth knocked once against his chest as he leaned to drink, as if to remind him that kindness and superstition and ruin could all three be carried in a single small weight.</w:t>
+      </w:r>
+    </w:p>
+    <w:p>
+      <w:pPr>
+        <w:spacing w:line="348" w:lineRule="auto" w:after="0" w:before="0"/>
+        <w:ind w:firstLine="288"/>
+      </w:pPr>
+      <w:r>
+        <w:rPr>
+          <w:rFonts w:ascii="EB Garamond" w:hAnsi="EB Garamond"/>
+          <w:b w:val="0"/>
+          <w:sz w:val="27"/>
+        </w:rPr>
+      </w:r>
+    </w:p>
+    <w:p>
+      <w:pPr>
+        <w:spacing w:line="348" w:lineRule="auto" w:after="0" w:before="0"/>
+        <w:ind w:firstLine="0"/>
+        <w:jc w:val="center"/>
+      </w:pPr>
+      <w:r>
+        <w:rPr>
+          <w:rFonts w:ascii="EB Garamond" w:hAnsi="EB Garamond"/>
           <w:b/>
           <w:sz w:val="28"/>
         </w:rPr>
@@ -5151,259 +5264,119 @@
           <w:b w:val="0"/>
           <w:sz w:val="27"/>
         </w:rPr>
-        <w:t>Then came the false lead, and the book will slow down for it, because a mercy is only a mercy when you can see the bill, and this one has a bill.</w:t>
-      </w:r>
-    </w:p>
-    <w:p>
-      <w:pPr>
-        <w:spacing w:line="348" w:lineRule="auto" w:after="0" w:before="0"/>
-        <w:ind w:firstLine="288"/>
-      </w:pPr>
-      <w:r>
-        <w:rPr>
-          <w:rFonts w:ascii="EB Garamond" w:hAnsi="EB Garamond"/>
-          <w:b w:val="0"/>
-          <w:sz w:val="27"/>
-        </w:rPr>
-        <w:t>It was on a coast stretch he had walked before, in a year when the dates at Ghadir had come in well enough to spare him longer. He heard, through a chain of mouths, of a woman of about the right age, from the Horn or from "down there," with a mark below the ear. He went. He took his time. He did not hurry, because a hurrying man in that country is a man with a story other men can price.</w:t>
-      </w:r>
-    </w:p>
-    <w:p>
-      <w:pPr>
-        <w:spacing w:line="348" w:lineRule="auto" w:after="0" w:before="0"/>
-        <w:ind w:firstLine="288"/>
-      </w:pPr>
-      <w:r>
-        <w:rPr>
-          <w:rFonts w:ascii="EB Garamond" w:hAnsi="EB Garamond"/>
-          <w:b w:val="0"/>
-          <w:sz w:val="27"/>
-        </w:rPr>
-        <w:t>He saw her in the doorway of a merchant's service rooms — not chained, not free, the in-between condition the quiet trade preferred. She was thinner than Wadha. She held her head in a way that was not, as Wadha had once described it, her sister's way; but a description is not a body. And the mark was there. Dark. Below the left ear. The size of a date-stone.</w:t>
-      </w:r>
-    </w:p>
-    <w:p>
-      <w:pPr>
-        <w:spacing w:line="348" w:lineRule="auto" w:after="0" w:before="0"/>
-        <w:ind w:firstLine="288"/>
-      </w:pPr>
-      <w:r>
-        <w:rPr>
-          <w:rFonts w:ascii="EB Garamond" w:hAnsi="EB Garamond"/>
-          <w:b w:val="0"/>
-          <w:sz w:val="27"/>
-        </w:rPr>
-        <w:t>For one long breath he believed.</w:t>
-      </w:r>
-    </w:p>
-    <w:p>
-      <w:pPr>
-        <w:spacing w:line="348" w:lineRule="auto" w:after="0" w:before="0"/>
-        <w:ind w:firstLine="288"/>
-      </w:pPr>
-      <w:r>
-        <w:rPr>
-          <w:rFonts w:ascii="EB Garamond" w:hAnsi="EB Garamond"/>
-          <w:b w:val="0"/>
-          <w:sz w:val="27"/>
-        </w:rPr>
-        <w:t>The man who spoke for her was not cruel in the way of stories. He was merely busy. He named one price for her papers of manumission and another for "trouble," and the two together were more than Khamis had brought and near enough to what the household could spare that the winter would feel it. When Khamis asked for the papers to be drawn, the clerk found reasons for delay: a witness absent, a seal not to hand. He sat three days in an outer room while the reasons multiplied. He did not shout. He counted. On the third day he said, mildly, that he would carry his silver instead to the qadi, and to a certain man whose name the clerk respected more than he respected the law, and the papers were finished before that evening's prayer.</w:t>
-      </w:r>
-    </w:p>
-    <w:p>
-      <w:pPr>
-        <w:spacing w:line="348" w:lineRule="auto" w:after="0" w:before="0"/>
-        <w:ind w:firstLine="288"/>
-      </w:pPr>
-      <w:r>
-        <w:rPr>
-          <w:rFonts w:ascii="EB Garamond" w:hAnsi="EB Garamond"/>
-          <w:b w:val="0"/>
-          <w:sz w:val="27"/>
-        </w:rPr>
-        <w:t>"You see," the clerk said. "Patience."</w:t>
-      </w:r>
-    </w:p>
-    <w:p>
-      <w:pPr>
-        <w:spacing w:line="348" w:lineRule="auto" w:after="0" w:before="0"/>
-        <w:ind w:firstLine="288"/>
-      </w:pPr>
-      <w:r>
-        <w:rPr>
-          <w:rFonts w:ascii="EB Garamond" w:hAnsi="EB Garamond"/>
-          <w:b w:val="0"/>
-          <w:sz w:val="27"/>
-        </w:rPr>
-        <w:t>"I see," Khamis said. "I will not practice it in this room again."</w:t>
-      </w:r>
-    </w:p>
-    <w:p>
-      <w:pPr>
-        <w:spacing w:line="348" w:lineRule="auto" w:after="0" w:before="0"/>
-        <w:ind w:firstLine="288"/>
-      </w:pPr>
-      <w:r>
-        <w:rPr>
-          <w:rFonts w:ascii="EB Garamond" w:hAnsi="EB Garamond"/>
-          <w:b w:val="0"/>
-          <w:sz w:val="27"/>
-        </w:rPr>
-        <w:t>He had gone home once between the asking and the paying, and come back with more silver — silver that meant a repair at the well put off, a leaner Eid, a conversation with Talal that cost him some pride. Talal gave him part of it without a speech, because Talal understood debts that are never written down. Wadha took a cloth of coins from the grain-jar and put it in his hand and did not ask whether this time the birthmark would be the right birthmark. Her face said she already knew that hope is a tool that cuts the hand that grips it.</w:t>
-      </w:r>
-    </w:p>
-    <w:p>
-      <w:pPr>
-        <w:spacing w:line="348" w:lineRule="auto" w:after="0" w:before="0"/>
-        <w:ind w:firstLine="288"/>
-      </w:pPr>
-      <w:r>
-        <w:rPr>
-          <w:rFonts w:ascii="EB Garamond" w:hAnsi="EB Garamond"/>
-          <w:b w:val="0"/>
-          <w:sz w:val="27"/>
-        </w:rPr>
-        <w:t>He paid. The woman walked out with him into a sun that promised nothing.</w:t>
-      </w:r>
-    </w:p>
-    <w:p>
-      <w:pPr>
-        <w:spacing w:line="348" w:lineRule="auto" w:after="0" w:before="0"/>
-        <w:ind w:firstLine="288"/>
-      </w:pPr>
-      <w:r>
-        <w:rPr>
-          <w:rFonts w:ascii="EB Garamond" w:hAnsi="EB Garamond"/>
-          <w:b w:val="0"/>
-          <w:sz w:val="27"/>
-        </w:rPr>
-        <w:t>Her name was not Munira. She said so herself, simply, almost surprised that anyone would think otherwise. She had worn other names. She did not remember a sister at any Ghadir. She remembered a mother on a coast, and a sale, and a long quiet after. When he asked about the mark she touched it and shrugged.</w:t>
-      </w:r>
-    </w:p>
-    <w:p>
-      <w:pPr>
-        <w:spacing w:line="348" w:lineRule="auto" w:after="0" w:before="0"/>
-        <w:ind w:firstLine="288"/>
-      </w:pPr>
-      <w:r>
-        <w:rPr>
-          <w:rFonts w:ascii="EB Garamond" w:hAnsi="EB Garamond"/>
-          <w:b w:val="0"/>
-          <w:sz w:val="27"/>
-        </w:rPr>
-        <w:t>"Many people have marks," she said. "God writes on us where He likes."</w:t>
-      </w:r>
-    </w:p>
-    <w:p>
-      <w:pPr>
-        <w:spacing w:line="348" w:lineRule="auto" w:after="0" w:before="0"/>
-        <w:ind w:firstLine="288"/>
-      </w:pPr>
-      <w:r>
-        <w:rPr>
-          <w:rFonts w:ascii="EB Garamond" w:hAnsi="EB Garamond"/>
-          <w:b w:val="0"/>
-          <w:sz w:val="27"/>
-        </w:rPr>
-        <w:t>He stood there with the costly papers of a freedom that was real and the empty hands of a search that had failed in the most expensive way there is, and for a moment the arithmetic in his head would not run at all. Then it ran. It always ran.</w:t>
-      </w:r>
-    </w:p>
-    <w:p>
-      <w:pPr>
-        <w:spacing w:line="348" w:lineRule="auto" w:after="0" w:before="0"/>
-        <w:ind w:firstLine="288"/>
-      </w:pPr>
-      <w:r>
-        <w:rPr>
-          <w:rFonts w:ascii="EB Garamond" w:hAnsi="EB Garamond"/>
-          <w:b w:val="0"/>
-          <w:sz w:val="27"/>
-        </w:rPr>
-        <w:t>He asked her where she wished to go. She named a town where a cousin might yet be living. He walked her part of the way and gave her what silver he could still spare, and he did not ask her to be grateful, because gratitude is another kind of chain if you are not careful with it.</w:t>
-      </w:r>
-    </w:p>
-    <w:p>
-      <w:pPr>
-        <w:spacing w:line="348" w:lineRule="auto" w:after="0" w:before="0"/>
-        <w:ind w:firstLine="288"/>
-      </w:pPr>
-      <w:r>
-        <w:rPr>
-          <w:rFonts w:ascii="EB Garamond" w:hAnsi="EB Garamond"/>
-          <w:b w:val="0"/>
-          <w:sz w:val="27"/>
-        </w:rPr>
-        <w:t>Her name, she told him on the road, was Amina now.</w:t>
-      </w:r>
-    </w:p>
-    <w:p>
-      <w:pPr>
-        <w:spacing w:line="348" w:lineRule="auto" w:after="0" w:before="0"/>
-        <w:ind w:firstLine="288"/>
-      </w:pPr>
-      <w:r>
-        <w:rPr>
-          <w:rFonts w:ascii="EB Garamond" w:hAnsi="EB Garamond"/>
-          <w:b w:val="0"/>
-          <w:sz w:val="27"/>
-        </w:rPr>
-        <w:t>"Why pay," she asked, "if I was not the one you wanted?"</w:t>
-      </w:r>
-    </w:p>
-    <w:p>
-      <w:pPr>
-        <w:spacing w:line="348" w:lineRule="auto" w:after="0" w:before="0"/>
-        <w:ind w:firstLine="288"/>
-      </w:pPr>
-      <w:r>
-        <w:rPr>
-          <w:rFonts w:ascii="EB Garamond" w:hAnsi="EB Garamond"/>
-          <w:b w:val="0"/>
-          <w:sz w:val="27"/>
-        </w:rPr>
-        <w:t>"Because the door was real," he said, "even when the name behind it was not."</w:t>
-      </w:r>
-    </w:p>
-    <w:p>
-      <w:pPr>
-        <w:spacing w:line="348" w:lineRule="auto" w:after="0" w:before="0"/>
-        <w:ind w:firstLine="288"/>
-      </w:pPr>
-      <w:r>
-        <w:rPr>
-          <w:rFonts w:ascii="EB Garamond" w:hAnsi="EB Garamond"/>
-          <w:b w:val="0"/>
-          <w:sz w:val="27"/>
-        </w:rPr>
-        <w:t>She walked a while. "Then you are a fool, or a kind of Muslim I do not often meet."</w:t>
-      </w:r>
-    </w:p>
-    <w:p>
-      <w:pPr>
-        <w:spacing w:line="348" w:lineRule="auto" w:after="0" w:before="0"/>
-        <w:ind w:firstLine="288"/>
-      </w:pPr>
-      <w:r>
-        <w:rPr>
-          <w:rFonts w:ascii="EB Garamond" w:hAnsi="EB Garamond"/>
-          <w:b w:val="0"/>
-          <w:sz w:val="27"/>
-        </w:rPr>
-        <w:t>"I am a water-man," he said. "We hate waste. Leaving you in that room would have been a waste of a different kind."</w:t>
-      </w:r>
-    </w:p>
-    <w:p>
-      <w:pPr>
-        <w:spacing w:line="348" w:lineRule="auto" w:after="0" w:before="0"/>
-        <w:ind w:firstLine="288"/>
-      </w:pPr>
-      <w:r>
-        <w:rPr>
-          <w:rFonts w:ascii="EB Garamond" w:hAnsi="EB Garamond"/>
-          <w:b w:val="0"/>
-          <w:sz w:val="27"/>
-        </w:rPr>
-        <w:t>When they parted she did not bless him elaborately. She said, "If you find your woman, do not tell her you freed a stranger first. Some loves cannot bear the comparison." And she went.</w:t>
+        <w:t>It was an old freed woman in a coast town who gave him, without meaning to, the only true method he ever had. She sold cooked beans from a doorway and had been, decades back, what Munira might now be; she recognized the particular way he asked before he had finished asking it.</w:t>
+      </w:r>
+    </w:p>
+    <w:p>
+      <w:pPr>
+        <w:spacing w:line="348" w:lineRule="auto" w:after="0" w:before="0"/>
+        <w:ind w:firstLine="288"/>
+      </w:pPr>
+      <w:r>
+        <w:rPr>
+          <w:rFonts w:ascii="EB Garamond" w:hAnsi="EB Garamond"/>
+          <w:b w:val="0"/>
+          <w:sz w:val="27"/>
+        </w:rPr>
+        <w:t>"You are hunting a woman," she said. "A sister, or a wife, or a mother. Only those three ask the way you ask."</w:t>
+      </w:r>
+    </w:p>
+    <w:p>
+      <w:pPr>
+        <w:spacing w:line="348" w:lineRule="auto" w:after="0" w:before="0"/>
+        <w:ind w:firstLine="288"/>
+      </w:pPr>
+      <w:r>
+        <w:rPr>
+          <w:rFonts w:ascii="EB Garamond" w:hAnsi="EB Garamond"/>
+          <w:b w:val="0"/>
+          <w:sz w:val="27"/>
+        </w:rPr>
+        <w:t>"A sister," he said. "My wife's."</w:t>
+      </w:r>
+    </w:p>
+    <w:p>
+      <w:pPr>
+        <w:spacing w:line="348" w:lineRule="auto" w:after="0" w:before="0"/>
+        <w:ind w:firstLine="288"/>
+      </w:pPr>
+      <w:r>
+        <w:rPr>
+          <w:rFonts w:ascii="EB Garamond" w:hAnsi="EB Garamond"/>
+          <w:b w:val="0"/>
+          <w:sz w:val="27"/>
+        </w:rPr>
+        <w:t>She stirred the pot. "Then hear me, and save your silver for bread. In the old days you looked in the market, because the market kept a kind of book and a face could be traced through it. There is no market now. The cruisers closed the beaches, and the trade did not die of it; it went into the houses. A woman does not stand on a block now. She is a servant who was always a servant, a wife who was always a wife, a ward taken in out of charity — that is the story the paper tells, and there is always paper now, because the foreigners taught everyone that paper is a kind of innocence."</w:t>
+      </w:r>
+    </w:p>
+    <w:p>
+      <w:pPr>
+        <w:spacing w:line="348" w:lineRule="auto" w:after="0" w:before="0"/>
+        <w:ind w:firstLine="288"/>
+      </w:pPr>
+      <w:r>
+        <w:rPr>
+          <w:rFonts w:ascii="EB Garamond" w:hAnsi="EB Garamond"/>
+          <w:b w:val="0"/>
+          <w:sz w:val="27"/>
+        </w:rPr>
+        <w:t>"Then how is she ever found?"</w:t>
+      </w:r>
+    </w:p>
+    <w:p>
+      <w:pPr>
+        <w:spacing w:line="348" w:lineRule="auto" w:after="0" w:before="0"/>
+        <w:ind w:firstLine="288"/>
+      </w:pPr>
+      <w:r>
+        <w:rPr>
+          <w:rFonts w:ascii="EB Garamond" w:hAnsi="EB Garamond"/>
+          <w:b w:val="0"/>
+          <w:sz w:val="27"/>
+        </w:rPr>
+        <w:t>"She is not found by asking after a slave," the old woman said. "There are no slaves now, you understand — only households with one mouth more than their blood accounts for. You do not ask, is there a slave. You ask, whose is that woman, and why does the number of the household not match the number of the family. You look for the mouth that does not fit the family tree." She tapped the spoon on the rim. "It is slower. It is the only way that is not a lie sold back to you."</w:t>
+      </w:r>
+    </w:p>
+    <w:p>
+      <w:pPr>
+        <w:spacing w:line="348" w:lineRule="auto" w:after="0" w:before="0"/>
+        <w:ind w:firstLine="288"/>
+      </w:pPr>
+      <w:r>
+        <w:rPr>
+          <w:rFonts w:ascii="EB Garamond" w:hAnsi="EB Garamond"/>
+          <w:b w:val="0"/>
+          <w:sz w:val="27"/>
+        </w:rPr>
+        <w:t>He gave her more than the beans were worth and she took it without pretending otherwise.</w:t>
+      </w:r>
+    </w:p>
+    <w:p>
+      <w:pPr>
+        <w:spacing w:line="348" w:lineRule="auto" w:after="0" w:before="0"/>
+        <w:ind w:firstLine="288"/>
+      </w:pPr>
+      <w:r>
+        <w:rPr>
+          <w:rFonts w:ascii="EB Garamond" w:hAnsi="EB Garamond"/>
+          <w:b w:val="0"/>
+          <w:sz w:val="27"/>
+        </w:rPr>
+        <w:t>"You will most likely not find her," she said as he rose. "I say it not to wound you. I say it so that when you have not found her in twenty years you do not decide God hates you. God did not hide her. Men did, and men are patient, and paper is patient, and the sea keeps no register of what it carried." She looked back at her pot. "But count the mouths at every fire, and find the one the blood does not explain. It is the only crack the age left open."</w:t>
+      </w:r>
+    </w:p>
+    <w:p>
+      <w:pPr>
+        <w:spacing w:line="348" w:lineRule="auto" w:after="0" w:before="0"/>
+        <w:ind w:firstLine="288"/>
+      </w:pPr>
+      <w:r>
+        <w:rPr>
+          <w:rFonts w:ascii="EB Garamond" w:hAnsi="EB Garamond"/>
+          <w:b w:val="0"/>
+          <w:sz w:val="27"/>
+        </w:rPr>
+        <w:t>He carried that sentence the rest of his life — look for the mouth that does not fit — and it made him, over the years, a reader of households the way he was a reader of faces: counting the living around a fire and asking, silently, which of you is here by a story and not by blood.</w:t>
       </w:r>
     </w:p>
     <w:p>
@@ -5432,105 +5405,259 @@
           <w:b w:val="0"/>
           <w:sz w:val="27"/>
         </w:rPr>
-        <w:t>That night, alone on a track between the thorn and the stars, he held the dark pearl in his fist until it warmed, and he understood — not as a revelation, as a line entered in a book — that mercy and error can share a single purchase, and that he would carry both of them home.</w:t>
-      </w:r>
-    </w:p>
-    <w:p>
-      <w:pPr>
-        <w:spacing w:line="348" w:lineRule="auto" w:after="0" w:before="0"/>
-        <w:ind w:firstLine="288"/>
-      </w:pPr>
-      <w:r>
-        <w:rPr>
-          <w:rFonts w:ascii="EB Garamond" w:hAnsi="EB Garamond"/>
-          <w:b w:val="0"/>
-          <w:sz w:val="27"/>
-        </w:rPr>
-        <w:t>He did not tell Wadha the whole of it, at first. He told her he had freed a woman who was not her sister. Wadha closed her eyes, and when she opened them she was still Wadha.</w:t>
-      </w:r>
-    </w:p>
-    <w:p>
-      <w:pPr>
-        <w:spacing w:line="348" w:lineRule="auto" w:after="0" w:before="0"/>
-        <w:ind w:firstLine="288"/>
-      </w:pPr>
-      <w:r>
-        <w:rPr>
-          <w:rFonts w:ascii="EB Garamond" w:hAnsi="EB Garamond"/>
-          <w:b w:val="0"/>
-          <w:sz w:val="27"/>
-        </w:rPr>
-        <w:t>"Good," she said. "Then the silver did one true thing, even if it did not do the thing we wanted."</w:t>
-      </w:r>
-    </w:p>
-    <w:p>
-      <w:pPr>
-        <w:spacing w:line="348" w:lineRule="auto" w:after="0" w:before="0"/>
-        <w:ind w:firstLine="288"/>
-      </w:pPr>
-      <w:r>
-        <w:rPr>
-          <w:rFonts w:ascii="EB Garamond" w:hAnsi="EB Garamond"/>
-          <w:b w:val="0"/>
-          <w:sz w:val="27"/>
-        </w:rPr>
-        <w:t>Months later the freed woman sent word through a third mouth: she had found the cousin, she was working, she prayed for him. He could not read the note. Wadha read it aloud without ornament and then put it in the grain-jar with the other small salvations.</w:t>
-      </w:r>
-    </w:p>
-    <w:p>
-      <w:pPr>
-        <w:spacing w:line="348" w:lineRule="auto" w:after="0" w:before="0"/>
-        <w:ind w:firstLine="288"/>
-      </w:pPr>
-      <w:r>
-        <w:rPr>
-          <w:rFonts w:ascii="EB Garamond" w:hAnsi="EB Garamond"/>
-          <w:b w:val="0"/>
-          <w:sz w:val="27"/>
-        </w:rPr>
-        <w:t>"You did not buy Munira," Wadha said.</w:t>
-      </w:r>
-    </w:p>
-    <w:p>
-      <w:pPr>
-        <w:spacing w:line="348" w:lineRule="auto" w:after="0" w:before="0"/>
-        <w:ind w:firstLine="288"/>
-      </w:pPr>
-      <w:r>
-        <w:rPr>
-          <w:rFonts w:ascii="EB Garamond" w:hAnsi="EB Garamond"/>
-          <w:b w:val="0"/>
-          <w:sz w:val="27"/>
-        </w:rPr>
-        <w:t>"I bought a morning when a door opened," he said. "That will have to be enough for that silver."</w:t>
-      </w:r>
-    </w:p>
-    <w:p>
-      <w:pPr>
-        <w:spacing w:line="348" w:lineRule="auto" w:after="0" w:before="0"/>
-        <w:ind w:firstLine="288"/>
-      </w:pPr>
-      <w:r>
-        <w:rPr>
-          <w:rFonts w:ascii="EB Garamond" w:hAnsi="EB Garamond"/>
-          <w:b w:val="0"/>
-          <w:sz w:val="27"/>
-        </w:rPr>
-        <w:t>"It is enough," she said. "Only do not become a man who loves only the searches that succeed. Those men leave the living lying on the ground."</w:t>
-      </w:r>
-    </w:p>
-    <w:p>
-      <w:pPr>
-        <w:spacing w:line="348" w:lineRule="auto" w:after="0" w:before="0"/>
-        <w:ind w:firstLine="288"/>
-      </w:pPr>
-      <w:r>
-        <w:rPr>
-          <w:rFonts w:ascii="EB Garamond" w:hAnsi="EB Garamond"/>
-          <w:b w:val="0"/>
-          <w:sz w:val="27"/>
-        </w:rPr>
-        <w:t>The book will say here, once, because the reader must hear it and no one in the scene ever will: he still did not know that the name Marzuq had been carried before, generations back, written in no book he would ever see, by a man of a branch of a family he did not know he had married into. He believed he had invented a hope. He had inherited one. The fortunate one walked the roads and did not feel fortunate, which is very often how providence looks from the inside of it.</w:t>
+        <w:t>Then came the false lead, and the book will slow down for it, because a mercy is only a mercy when you can see the bill, and this one has a bill.</w:t>
+      </w:r>
+    </w:p>
+    <w:p>
+      <w:pPr>
+        <w:spacing w:line="348" w:lineRule="auto" w:after="0" w:before="0"/>
+        <w:ind w:firstLine="288"/>
+      </w:pPr>
+      <w:r>
+        <w:rPr>
+          <w:rFonts w:ascii="EB Garamond" w:hAnsi="EB Garamond"/>
+          <w:b w:val="0"/>
+          <w:sz w:val="27"/>
+        </w:rPr>
+        <w:t>It was on a coast stretch he had walked before, in a year when the dates at Ghadir had come in well enough to spare him longer. He heard, through a chain of mouths, of a woman of about the right age, from the Horn or from "down there," with a mark below the ear. He went. He took his time. He did not hurry, because a hurrying man in that country is a man with a story other men can price.</w:t>
+      </w:r>
+    </w:p>
+    <w:p>
+      <w:pPr>
+        <w:spacing w:line="348" w:lineRule="auto" w:after="0" w:before="0"/>
+        <w:ind w:firstLine="288"/>
+      </w:pPr>
+      <w:r>
+        <w:rPr>
+          <w:rFonts w:ascii="EB Garamond" w:hAnsi="EB Garamond"/>
+          <w:b w:val="0"/>
+          <w:sz w:val="27"/>
+        </w:rPr>
+        <w:t>He saw her in the doorway of a merchant's service rooms — not chained, not free, the in-between condition the quiet trade preferred. She was thinner than Wadha. She held her head in a way that was not, as Wadha had once described it, her sister's way; but a description is not a body. And the mark was there. Dark. Below the left ear. The size of a date-stone.</w:t>
+      </w:r>
+    </w:p>
+    <w:p>
+      <w:pPr>
+        <w:spacing w:line="348" w:lineRule="auto" w:after="0" w:before="0"/>
+        <w:ind w:firstLine="288"/>
+      </w:pPr>
+      <w:r>
+        <w:rPr>
+          <w:rFonts w:ascii="EB Garamond" w:hAnsi="EB Garamond"/>
+          <w:b w:val="0"/>
+          <w:sz w:val="27"/>
+        </w:rPr>
+        <w:t>For one long breath he believed.</w:t>
+      </w:r>
+    </w:p>
+    <w:p>
+      <w:pPr>
+        <w:spacing w:line="348" w:lineRule="auto" w:after="0" w:before="0"/>
+        <w:ind w:firstLine="288"/>
+      </w:pPr>
+      <w:r>
+        <w:rPr>
+          <w:rFonts w:ascii="EB Garamond" w:hAnsi="EB Garamond"/>
+          <w:b w:val="0"/>
+          <w:sz w:val="27"/>
+        </w:rPr>
+        <w:t>The man who spoke for her was not cruel in the way of stories. He was merely busy. He named one price for her papers of manumission and another for "trouble," and the two together were more than Khamis had brought and near enough to what the household could spare that the winter would feel it. When Khamis asked for the papers to be drawn, the clerk found reasons for delay: a witness absent, a seal not to hand. He sat three days in an outer room while the reasons multiplied. He did not shout. He counted. On the third day he said, mildly, that he would carry his silver instead to the qadi, and to a certain man whose name the clerk respected more than he respected the law, and the papers were finished before that evening's prayer.</w:t>
+      </w:r>
+    </w:p>
+    <w:p>
+      <w:pPr>
+        <w:spacing w:line="348" w:lineRule="auto" w:after="0" w:before="0"/>
+        <w:ind w:firstLine="288"/>
+      </w:pPr>
+      <w:r>
+        <w:rPr>
+          <w:rFonts w:ascii="EB Garamond" w:hAnsi="EB Garamond"/>
+          <w:b w:val="0"/>
+          <w:sz w:val="27"/>
+        </w:rPr>
+        <w:t>"You see," the clerk said. "Patience."</w:t>
+      </w:r>
+    </w:p>
+    <w:p>
+      <w:pPr>
+        <w:spacing w:line="348" w:lineRule="auto" w:after="0" w:before="0"/>
+        <w:ind w:firstLine="288"/>
+      </w:pPr>
+      <w:r>
+        <w:rPr>
+          <w:rFonts w:ascii="EB Garamond" w:hAnsi="EB Garamond"/>
+          <w:b w:val="0"/>
+          <w:sz w:val="27"/>
+        </w:rPr>
+        <w:t>"I see," Khamis said. "I will not practice it in this room again."</w:t>
+      </w:r>
+    </w:p>
+    <w:p>
+      <w:pPr>
+        <w:spacing w:line="348" w:lineRule="auto" w:after="0" w:before="0"/>
+        <w:ind w:firstLine="288"/>
+      </w:pPr>
+      <w:r>
+        <w:rPr>
+          <w:rFonts w:ascii="EB Garamond" w:hAnsi="EB Garamond"/>
+          <w:b w:val="0"/>
+          <w:sz w:val="27"/>
+        </w:rPr>
+        <w:t>He had gone home once between the asking and the paying, and come back with more silver — silver that meant a repair at the well put off, a leaner Eid, a conversation with Talal that cost him some pride. Talal gave him part of it without a speech, because Talal understood debts that are never written down. Wadha took a cloth of coins from the grain-jar and put it in his hand and did not ask whether this time the birthmark would be the right birthmark. Her face said she already knew that hope is a tool that cuts the hand that grips it.</w:t>
+      </w:r>
+    </w:p>
+    <w:p>
+      <w:pPr>
+        <w:spacing w:line="348" w:lineRule="auto" w:after="0" w:before="0"/>
+        <w:ind w:firstLine="288"/>
+      </w:pPr>
+      <w:r>
+        <w:rPr>
+          <w:rFonts w:ascii="EB Garamond" w:hAnsi="EB Garamond"/>
+          <w:b w:val="0"/>
+          <w:sz w:val="27"/>
+        </w:rPr>
+        <w:t>He paid. The woman walked out with him into a sun that promised nothing.</w:t>
+      </w:r>
+    </w:p>
+    <w:p>
+      <w:pPr>
+        <w:spacing w:line="348" w:lineRule="auto" w:after="0" w:before="0"/>
+        <w:ind w:firstLine="288"/>
+      </w:pPr>
+      <w:r>
+        <w:rPr>
+          <w:rFonts w:ascii="EB Garamond" w:hAnsi="EB Garamond"/>
+          <w:b w:val="0"/>
+          <w:sz w:val="27"/>
+        </w:rPr>
+        <w:t>Her name was not Munira. She said so herself, simply, almost surprised that anyone would think otherwise. She had worn other names. She did not remember a sister at any Ghadir. She remembered a mother on a coast, and a sale, and a long quiet after. When he asked about the mark she touched it and shrugged.</w:t>
+      </w:r>
+    </w:p>
+    <w:p>
+      <w:pPr>
+        <w:spacing w:line="348" w:lineRule="auto" w:after="0" w:before="0"/>
+        <w:ind w:firstLine="288"/>
+      </w:pPr>
+      <w:r>
+        <w:rPr>
+          <w:rFonts w:ascii="EB Garamond" w:hAnsi="EB Garamond"/>
+          <w:b w:val="0"/>
+          <w:sz w:val="27"/>
+        </w:rPr>
+        <w:t>"Many people have marks," she said. "God writes on us where He likes."</w:t>
+      </w:r>
+    </w:p>
+    <w:p>
+      <w:pPr>
+        <w:spacing w:line="348" w:lineRule="auto" w:after="0" w:before="0"/>
+        <w:ind w:firstLine="288"/>
+      </w:pPr>
+      <w:r>
+        <w:rPr>
+          <w:rFonts w:ascii="EB Garamond" w:hAnsi="EB Garamond"/>
+          <w:b w:val="0"/>
+          <w:sz w:val="27"/>
+        </w:rPr>
+        <w:t>He stood there with the costly papers of a freedom that was real and the empty hands of a search that had failed in the most expensive way there is, and for a moment the arithmetic in his head would not run at all. Then it ran. It always ran.</w:t>
+      </w:r>
+    </w:p>
+    <w:p>
+      <w:pPr>
+        <w:spacing w:line="348" w:lineRule="auto" w:after="0" w:before="0"/>
+        <w:ind w:firstLine="288"/>
+      </w:pPr>
+      <w:r>
+        <w:rPr>
+          <w:rFonts w:ascii="EB Garamond" w:hAnsi="EB Garamond"/>
+          <w:b w:val="0"/>
+          <w:sz w:val="27"/>
+        </w:rPr>
+        <w:t>He asked her where she wished to go. She named a town where a cousin might yet be living. He walked her part of the way and gave her what silver he could still spare, and he did not ask her to be grateful, because gratitude is another kind of chain if you are not careful with it.</w:t>
+      </w:r>
+    </w:p>
+    <w:p>
+      <w:pPr>
+        <w:spacing w:line="348" w:lineRule="auto" w:after="0" w:before="0"/>
+        <w:ind w:firstLine="288"/>
+      </w:pPr>
+      <w:r>
+        <w:rPr>
+          <w:rFonts w:ascii="EB Garamond" w:hAnsi="EB Garamond"/>
+          <w:b w:val="0"/>
+          <w:sz w:val="27"/>
+        </w:rPr>
+        <w:t>Her name, she told him on the road, was Amina now.</w:t>
+      </w:r>
+    </w:p>
+    <w:p>
+      <w:pPr>
+        <w:spacing w:line="348" w:lineRule="auto" w:after="0" w:before="0"/>
+        <w:ind w:firstLine="288"/>
+      </w:pPr>
+      <w:r>
+        <w:rPr>
+          <w:rFonts w:ascii="EB Garamond" w:hAnsi="EB Garamond"/>
+          <w:b w:val="0"/>
+          <w:sz w:val="27"/>
+        </w:rPr>
+        <w:t>"Why pay," she asked, "if I was not the one you wanted?"</w:t>
+      </w:r>
+    </w:p>
+    <w:p>
+      <w:pPr>
+        <w:spacing w:line="348" w:lineRule="auto" w:after="0" w:before="0"/>
+        <w:ind w:firstLine="288"/>
+      </w:pPr>
+      <w:r>
+        <w:rPr>
+          <w:rFonts w:ascii="EB Garamond" w:hAnsi="EB Garamond"/>
+          <w:b w:val="0"/>
+          <w:sz w:val="27"/>
+        </w:rPr>
+        <w:t>"Because the door was real," he said, "even when the name behind it was not."</w:t>
+      </w:r>
+    </w:p>
+    <w:p>
+      <w:pPr>
+        <w:spacing w:line="348" w:lineRule="auto" w:after="0" w:before="0"/>
+        <w:ind w:firstLine="288"/>
+      </w:pPr>
+      <w:r>
+        <w:rPr>
+          <w:rFonts w:ascii="EB Garamond" w:hAnsi="EB Garamond"/>
+          <w:b w:val="0"/>
+          <w:sz w:val="27"/>
+        </w:rPr>
+        <w:t>She walked a while. "Then you are a fool, or a kind of Muslim I do not often meet."</w:t>
+      </w:r>
+    </w:p>
+    <w:p>
+      <w:pPr>
+        <w:spacing w:line="348" w:lineRule="auto" w:after="0" w:before="0"/>
+        <w:ind w:firstLine="288"/>
+      </w:pPr>
+      <w:r>
+        <w:rPr>
+          <w:rFonts w:ascii="EB Garamond" w:hAnsi="EB Garamond"/>
+          <w:b w:val="0"/>
+          <w:sz w:val="27"/>
+        </w:rPr>
+        <w:t>"I am a water-man," he said. "We hate waste. Leaving you in that room would have been a waste of a different kind."</w:t>
+      </w:r>
+    </w:p>
+    <w:p>
+      <w:pPr>
+        <w:spacing w:line="348" w:lineRule="auto" w:after="0" w:before="0"/>
+        <w:ind w:firstLine="288"/>
+      </w:pPr>
+      <w:r>
+        <w:rPr>
+          <w:rFonts w:ascii="EB Garamond" w:hAnsi="EB Garamond"/>
+          <w:b w:val="0"/>
+          <w:sz w:val="27"/>
+        </w:rPr>
+        <w:t>When they parted she did not bless him elaborately. She said, "If you find your woman, do not tell her you freed a stranger first. Some loves cannot bear the comparison." And she went.</w:t>
       </w:r>
     </w:p>
     <w:p>
@@ -5559,132 +5686,105 @@
           <w:b w:val="0"/>
           <w:sz w:val="27"/>
         </w:rPr>
-        <w:t>Other seasons blurred into one another. A rumor in Jeddah. A denial in a Trucial creek. A man who swore he had seen Munira married and content and who then described a face that was not hers; Khamis paid for that lie with coffee and time, and not with violence, because violence would have ended the search in a way he could not afford.</w:t>
-      </w:r>
-    </w:p>
-    <w:p>
-      <w:pPr>
-        <w:spacing w:line="348" w:lineRule="auto" w:after="0" w:before="0"/>
-        <w:ind w:firstLine="288"/>
-      </w:pPr>
-      <w:r>
-        <w:rPr>
-          <w:rFonts w:ascii="EB Garamond" w:hAnsi="EB Garamond"/>
-          <w:b w:val="0"/>
-          <w:sz w:val="27"/>
-        </w:rPr>
-        <w:t>Once, years on, he saw the young hired man from that first autumn — the one who had bought two camels he had no business affording — older now, and thicker, across a crowded market. Their eyes met. Nothing was said. Everything was said. Khamis walked on, because knowing and proving were still two different countries, and he was still a citizen only of the first. In the market that day his hand had wanted, for one breath, to close on the man's throat. It did not. He kept his hands open and walked, and he told Wadha nothing of it that night, and the book tells you only because the reader is the third party to that marriage whether the two of them ever consented or not.</w:t>
-      </w:r>
-    </w:p>
-    <w:p>
-      <w:pPr>
-        <w:spacing w:line="348" w:lineRule="auto" w:after="0" w:before="0"/>
-        <w:ind w:firstLine="288"/>
-      </w:pPr>
-      <w:r>
-        <w:rPr>
-          <w:rFonts w:ascii="EB Garamond" w:hAnsi="EB Garamond"/>
-          <w:b w:val="0"/>
-          <w:sz w:val="27"/>
-        </w:rPr>
-        <w:t>He began, when Nura was old enough to ask, to teach her to watch a face while its owner ate. "Not to shame him," he said. "To know whether the story in his mouth matches the story in his hands."</w:t>
-      </w:r>
-    </w:p>
-    <w:p>
-      <w:pPr>
-        <w:spacing w:line="348" w:lineRule="auto" w:after="0" w:before="0"/>
-        <w:ind w:firstLine="288"/>
-      </w:pPr>
-      <w:r>
-        <w:rPr>
-          <w:rFonts w:ascii="EB Garamond" w:hAnsi="EB Garamond"/>
-          <w:b w:val="0"/>
-          <w:sz w:val="27"/>
-        </w:rPr>
-        <w:t>"Did you learn that at the wells?" she asked.</w:t>
-      </w:r>
-    </w:p>
-    <w:p>
-      <w:pPr>
-        <w:spacing w:line="348" w:lineRule="auto" w:after="0" w:before="0"/>
-        <w:ind w:firstLine="288"/>
-      </w:pPr>
-      <w:r>
-        <w:rPr>
-          <w:rFonts w:ascii="EB Garamond" w:hAnsi="EB Garamond"/>
-          <w:b w:val="0"/>
-          <w:sz w:val="27"/>
-        </w:rPr>
-        <w:t>"I learned it everywhere," he said. "The wells only gave it a clean place to practice."</w:t>
-      </w:r>
-    </w:p>
-    <w:p>
-      <w:pPr>
-        <w:spacing w:line="348" w:lineRule="auto" w:after="0" w:before="0"/>
-        <w:ind w:firstLine="288"/>
-      </w:pPr>
-      <w:r>
-        <w:rPr>
-          <w:rFonts w:ascii="EB Garamond" w:hAnsi="EB Garamond"/>
-          <w:b w:val="0"/>
-          <w:sz w:val="27"/>
-        </w:rPr>
-        <w:t>On the longer trips he carried a stick notched for his expenses, because the pearl summer had cured him for good of trusting another man's page. Wadha teased him once that he loved the stick better than poetry.</w:t>
-      </w:r>
-    </w:p>
-    <w:p>
-      <w:pPr>
-        <w:spacing w:line="348" w:lineRule="auto" w:after="0" w:before="0"/>
-        <w:ind w:firstLine="288"/>
-      </w:pPr>
-      <w:r>
-        <w:rPr>
-          <w:rFonts w:ascii="EB Garamond" w:hAnsi="EB Garamond"/>
-          <w:b w:val="0"/>
-          <w:sz w:val="27"/>
-        </w:rPr>
-        <w:t>"The stick keeps us free," he said. "Your poetry keeps us human. I will not choose between them."</w:t>
-      </w:r>
-    </w:p>
-    <w:p>
-      <w:pPr>
-        <w:spacing w:line="348" w:lineRule="auto" w:after="0" w:before="0"/>
-        <w:ind w:firstLine="288"/>
-      </w:pPr>
-      <w:r>
-        <w:rPr>
-          <w:rFonts w:ascii="EB Garamond" w:hAnsi="EB Garamond"/>
-          <w:b w:val="0"/>
-          <w:sz w:val="27"/>
-        </w:rPr>
-        <w:t>"Then carry both," she said, "and come home."</w:t>
-      </w:r>
-    </w:p>
-    <w:p>
-      <w:pPr>
-        <w:spacing w:line="348" w:lineRule="auto" w:after="0" w:before="0"/>
-        <w:ind w:firstLine="288"/>
-      </w:pPr>
-      <w:r>
-        <w:rPr>
-          <w:rFonts w:ascii="EB Garamond" w:hAnsi="EB Garamond"/>
-          <w:b w:val="0"/>
-          <w:sz w:val="27"/>
-        </w:rPr>
-        <w:t>He came home. Again, and again. The last image of these years is not a found sister. It is a man washing the coast-dust from his feet at the edge of the Ghadir palms while a daughter watches and a wife sets down bread, and a fortunate name is folded away in a cloth until the next leaving, the way you wrap a tool that cuts and must not be left where a child can find it.</w:t>
-      </w:r>
-    </w:p>
-    <w:p>
-      <w:pPr>
-        <w:spacing w:line="348" w:lineRule="auto" w:after="0" w:before="0"/>
-        <w:ind w:firstLine="288"/>
-      </w:pPr>
-      <w:r>
-        <w:rPr>
-          <w:rFonts w:ascii="EB Garamond" w:hAnsi="EB Garamond"/>
-          <w:b w:val="0"/>
-          <w:sz w:val="27"/>
-        </w:rPr>
+        <w:t>That night, alone on a track between the thorn and the stars, he held the dark pearl in his fist until it warmed, and he understood — not as a revelation, as a line entered in a book — that mercy and error can share a single purchase, and that he would carry both of them home.</w:t>
+      </w:r>
+    </w:p>
+    <w:p>
+      <w:pPr>
+        <w:spacing w:line="348" w:lineRule="auto" w:after="0" w:before="0"/>
+        <w:ind w:firstLine="288"/>
+      </w:pPr>
+      <w:r>
+        <w:rPr>
+          <w:rFonts w:ascii="EB Garamond" w:hAnsi="EB Garamond"/>
+          <w:b w:val="0"/>
+          <w:sz w:val="27"/>
+        </w:rPr>
+        <w:t>He did not tell Wadha the whole of it, at first. He told her he had freed a woman who was not her sister. Wadha closed her eyes, and when she opened them she was still Wadha.</w:t>
+      </w:r>
+    </w:p>
+    <w:p>
+      <w:pPr>
+        <w:spacing w:line="348" w:lineRule="auto" w:after="0" w:before="0"/>
+        <w:ind w:firstLine="288"/>
+      </w:pPr>
+      <w:r>
+        <w:rPr>
+          <w:rFonts w:ascii="EB Garamond" w:hAnsi="EB Garamond"/>
+          <w:b w:val="0"/>
+          <w:sz w:val="27"/>
+        </w:rPr>
+        <w:t>"Good," she said. "Then the silver did one true thing, even if it did not do the thing we wanted."</w:t>
+      </w:r>
+    </w:p>
+    <w:p>
+      <w:pPr>
+        <w:spacing w:line="348" w:lineRule="auto" w:after="0" w:before="0"/>
+        <w:ind w:firstLine="288"/>
+      </w:pPr>
+      <w:r>
+        <w:rPr>
+          <w:rFonts w:ascii="EB Garamond" w:hAnsi="EB Garamond"/>
+          <w:b w:val="0"/>
+          <w:sz w:val="27"/>
+        </w:rPr>
+        <w:t>Months later the freed woman sent word through a third mouth: she had found the cousin, she was working, she prayed for him. He could not read the note. Wadha read it aloud without ornament and then put it in the grain-jar with the other small salvations.</w:t>
+      </w:r>
+    </w:p>
+    <w:p>
+      <w:pPr>
+        <w:spacing w:line="348" w:lineRule="auto" w:after="0" w:before="0"/>
+        <w:ind w:firstLine="288"/>
+      </w:pPr>
+      <w:r>
+        <w:rPr>
+          <w:rFonts w:ascii="EB Garamond" w:hAnsi="EB Garamond"/>
+          <w:b w:val="0"/>
+          <w:sz w:val="27"/>
+        </w:rPr>
+        <w:t>"You did not buy Munira," Wadha said.</w:t>
+      </w:r>
+    </w:p>
+    <w:p>
+      <w:pPr>
+        <w:spacing w:line="348" w:lineRule="auto" w:after="0" w:before="0"/>
+        <w:ind w:firstLine="288"/>
+      </w:pPr>
+      <w:r>
+        <w:rPr>
+          <w:rFonts w:ascii="EB Garamond" w:hAnsi="EB Garamond"/>
+          <w:b w:val="0"/>
+          <w:sz w:val="27"/>
+        </w:rPr>
+        <w:t>"I bought a morning when a door opened," he said. "That will have to be enough for that silver."</w:t>
+      </w:r>
+    </w:p>
+    <w:p>
+      <w:pPr>
+        <w:spacing w:line="348" w:lineRule="auto" w:after="0" w:before="0"/>
+        <w:ind w:firstLine="288"/>
+      </w:pPr>
+      <w:r>
+        <w:rPr>
+          <w:rFonts w:ascii="EB Garamond" w:hAnsi="EB Garamond"/>
+          <w:b w:val="0"/>
+          <w:sz w:val="27"/>
+        </w:rPr>
+        <w:t>"It is enough," she said. "Only do not become a man who loves only the searches that succeed. Those men leave the living lying on the ground."</w:t>
+      </w:r>
+    </w:p>
+    <w:p>
+      <w:pPr>
+        <w:spacing w:line="348" w:lineRule="auto" w:after="0" w:before="0"/>
+        <w:ind w:firstLine="288"/>
+      </w:pPr>
+      <w:r>
+        <w:rPr>
+          <w:rFonts w:ascii="EB Garamond" w:hAnsi="EB Garamond"/>
+          <w:b w:val="0"/>
+          <w:sz w:val="27"/>
+        </w:rPr>
+        <w:t>The book will say here, once, because the reader must hear it and no one in the scene ever will: he still did not know that the name Marzuq had been carried before, generations back, written in no book he would ever see, by a man of a branch of a family he did not know he had married into. He believed he had invented a hope. He had inherited one. The fortunate one walked the roads and did not feel fortunate, which is very often how providence looks from the inside of it.</w:t>
       </w:r>
     </w:p>
     <w:p>
@@ -5696,6 +5796,160 @@
       <w:r>
         <w:rPr>
           <w:rFonts w:ascii="EB Garamond" w:hAnsi="EB Garamond"/>
+          <w:b w:val="0"/>
+          <w:sz w:val="27"/>
+        </w:rPr>
+        <w:t>❦</w:t>
+      </w:r>
+    </w:p>
+    <w:p>
+      <w:pPr>
+        <w:spacing w:line="348" w:lineRule="auto" w:after="0" w:before="0"/>
+        <w:ind w:firstLine="0"/>
+      </w:pPr>
+      <w:r>
+        <w:rPr>
+          <w:rFonts w:ascii="EB Garamond" w:hAnsi="EB Garamond"/>
+          <w:b w:val="0"/>
+          <w:sz w:val="27"/>
+        </w:rPr>
+        <w:t>Other seasons blurred into one another. A rumor in Jeddah. A denial in a Trucial creek. A man who swore he had seen Munira married and content and who then described a face that was not hers; Khamis paid for that lie with coffee and time, and not with violence, because violence would have ended the search in a way he could not afford.</w:t>
+      </w:r>
+    </w:p>
+    <w:p>
+      <w:pPr>
+        <w:spacing w:line="348" w:lineRule="auto" w:after="0" w:before="0"/>
+        <w:ind w:firstLine="288"/>
+      </w:pPr>
+      <w:r>
+        <w:rPr>
+          <w:rFonts w:ascii="EB Garamond" w:hAnsi="EB Garamond"/>
+          <w:b w:val="0"/>
+          <w:sz w:val="27"/>
+        </w:rPr>
+        <w:t>Once, years on, he saw the young hired man from that first autumn — the one who had bought two camels he had no business affording — older now, and thicker, across a crowded market. Their eyes met. Nothing was said. Everything was said. Khamis walked on, because knowing and proving were still two different countries, and he was still a citizen only of the first. In the market that day his hand had wanted, for one breath, to close on the man's throat. It did not. He kept his hands open and walked, and he told Wadha nothing of it that night, and the book tells you only because the reader is the third party to that marriage whether the two of them ever consented or not.</w:t>
+      </w:r>
+    </w:p>
+    <w:p>
+      <w:pPr>
+        <w:spacing w:line="348" w:lineRule="auto" w:after="0" w:before="0"/>
+        <w:ind w:firstLine="288"/>
+      </w:pPr>
+      <w:r>
+        <w:rPr>
+          <w:rFonts w:ascii="EB Garamond" w:hAnsi="EB Garamond"/>
+          <w:b w:val="0"/>
+          <w:sz w:val="27"/>
+        </w:rPr>
+        <w:t>He began, when Nura was old enough to ask, to teach her to watch a face while its owner ate. "Not to shame him," he said. "To know whether the story in his mouth matches the story in his hands."</w:t>
+      </w:r>
+    </w:p>
+    <w:p>
+      <w:pPr>
+        <w:spacing w:line="348" w:lineRule="auto" w:after="0" w:before="0"/>
+        <w:ind w:firstLine="288"/>
+      </w:pPr>
+      <w:r>
+        <w:rPr>
+          <w:rFonts w:ascii="EB Garamond" w:hAnsi="EB Garamond"/>
+          <w:b w:val="0"/>
+          <w:sz w:val="27"/>
+        </w:rPr>
+        <w:t>"Did you learn that at the wells?" she asked.</w:t>
+      </w:r>
+    </w:p>
+    <w:p>
+      <w:pPr>
+        <w:spacing w:line="348" w:lineRule="auto" w:after="0" w:before="0"/>
+        <w:ind w:firstLine="288"/>
+      </w:pPr>
+      <w:r>
+        <w:rPr>
+          <w:rFonts w:ascii="EB Garamond" w:hAnsi="EB Garamond"/>
+          <w:b w:val="0"/>
+          <w:sz w:val="27"/>
+        </w:rPr>
+        <w:t>"I learned it everywhere," he said. "The wells only gave it a clean place to practice."</w:t>
+      </w:r>
+    </w:p>
+    <w:p>
+      <w:pPr>
+        <w:spacing w:line="348" w:lineRule="auto" w:after="0" w:before="0"/>
+        <w:ind w:firstLine="288"/>
+      </w:pPr>
+      <w:r>
+        <w:rPr>
+          <w:rFonts w:ascii="EB Garamond" w:hAnsi="EB Garamond"/>
+          <w:b w:val="0"/>
+          <w:sz w:val="27"/>
+        </w:rPr>
+        <w:t>On the longer trips he carried a stick notched for his expenses, because the pearl summer had cured him for good of trusting another man's page. Wadha teased him once that he loved the stick better than poetry.</w:t>
+      </w:r>
+    </w:p>
+    <w:p>
+      <w:pPr>
+        <w:spacing w:line="348" w:lineRule="auto" w:after="0" w:before="0"/>
+        <w:ind w:firstLine="288"/>
+      </w:pPr>
+      <w:r>
+        <w:rPr>
+          <w:rFonts w:ascii="EB Garamond" w:hAnsi="EB Garamond"/>
+          <w:b w:val="0"/>
+          <w:sz w:val="27"/>
+        </w:rPr>
+        <w:t>"The stick keeps us free," he said. "Your poetry keeps us human. I will not choose between them."</w:t>
+      </w:r>
+    </w:p>
+    <w:p>
+      <w:pPr>
+        <w:spacing w:line="348" w:lineRule="auto" w:after="0" w:before="0"/>
+        <w:ind w:firstLine="288"/>
+      </w:pPr>
+      <w:r>
+        <w:rPr>
+          <w:rFonts w:ascii="EB Garamond" w:hAnsi="EB Garamond"/>
+          <w:b w:val="0"/>
+          <w:sz w:val="27"/>
+        </w:rPr>
+        <w:t>"Then carry both," she said, "and come home."</w:t>
+      </w:r>
+    </w:p>
+    <w:p>
+      <w:pPr>
+        <w:spacing w:line="348" w:lineRule="auto" w:after="0" w:before="0"/>
+        <w:ind w:firstLine="288"/>
+      </w:pPr>
+      <w:r>
+        <w:rPr>
+          <w:rFonts w:ascii="EB Garamond" w:hAnsi="EB Garamond"/>
+          <w:b w:val="0"/>
+          <w:sz w:val="27"/>
+        </w:rPr>
+        <w:t>He came home. Again, and again. The last image of these years is not a found sister. It is a man washing the coast-dust from his feet at the edge of the Ghadir palms while a daughter watches and a wife sets down bread, and a fortunate name is folded away in a cloth until the next leaving, the way you wrap a tool that cuts and must not be left where a child can find it.</w:t>
+      </w:r>
+    </w:p>
+    <w:p>
+      <w:pPr>
+        <w:spacing w:line="348" w:lineRule="auto" w:after="0" w:before="0"/>
+        <w:ind w:firstLine="288"/>
+      </w:pPr>
+      <w:r>
+        <w:rPr>
+          <w:rFonts w:ascii="EB Garamond" w:hAnsi="EB Garamond"/>
+          <w:b w:val="0"/>
+          <w:sz w:val="27"/>
+        </w:rPr>
+      </w:r>
+    </w:p>
+    <w:p>
+      <w:pPr>
+        <w:spacing w:line="348" w:lineRule="auto" w:after="0" w:before="0"/>
+        <w:ind w:firstLine="0"/>
+        <w:jc w:val="center"/>
+      </w:pPr>
+      <w:r>
+        <w:rPr>
+          <w:rFonts w:ascii="EB Garamond" w:hAnsi="EB Garamond"/>
           <w:b/>
           <w:sz w:val="28"/>
         </w:rPr>
@@ -5770,6 +6024,62 @@
           <w:b w:val="0"/>
           <w:sz w:val="27"/>
         </w:rPr>
+        <w:t>Between the small graves there were also the births that held, and the book will not let the deaths speak louder than they earned. When Nura came — the daughter who would live, and outlive, and carry the line — she came at the end of a long night with the old women in the room and Khamis banished to the yard, where he drew water he did not need and counted the buckets to keep his hands from prayer, because prayer, that night, felt too much like bargaining. When they let him in, Wadha was grey with the work of it and fiercely awake, and she put the child against him without ceremony.</w:t>
+      </w:r>
+    </w:p>
+    <w:p>
+      <w:pPr>
+        <w:spacing w:line="348" w:lineRule="auto" w:after="0" w:before="0"/>
+        <w:ind w:firstLine="288"/>
+      </w:pPr>
+      <w:r>
+        <w:rPr>
+          <w:rFonts w:ascii="EB Garamond" w:hAnsi="EB Garamond"/>
+          <w:b w:val="0"/>
+          <w:sz w:val="27"/>
+        </w:rPr>
+        <w:t>"A daughter," he said, as though the fact needed confirming.</w:t>
+      </w:r>
+    </w:p>
+    <w:p>
+      <w:pPr>
+        <w:spacing w:line="348" w:lineRule="auto" w:after="0" w:before="0"/>
+        <w:ind w:firstLine="288"/>
+      </w:pPr>
+      <w:r>
+        <w:rPr>
+          <w:rFonts w:ascii="EB Garamond" w:hAnsi="EB Garamond"/>
+          <w:b w:val="0"/>
+          <w:sz w:val="27"/>
+        </w:rPr>
+        <w:t>"A daughter," Wadha agreed. "Do not look for your sister in her face. She is her own. Let her be her own."</w:t>
+      </w:r>
+    </w:p>
+    <w:p>
+      <w:pPr>
+        <w:spacing w:line="348" w:lineRule="auto" w:after="0" w:before="0"/>
+        <w:ind w:firstLine="288"/>
+      </w:pPr>
+      <w:r>
+        <w:rPr>
+          <w:rFonts w:ascii="EB Garamond" w:hAnsi="EB Garamond"/>
+          <w:b w:val="0"/>
+          <w:sz w:val="27"/>
+        </w:rPr>
+        <w:t>He had not known he was doing it. He stopped. It was the first of many times Wadha would see him reaching, without his own knowledge, for the lost woman in a living face, and call him back from it with three plain words.</w:t>
+      </w:r>
+    </w:p>
+    <w:p>
+      <w:pPr>
+        <w:spacing w:line="348" w:lineRule="auto" w:after="0" w:before="0"/>
+        <w:ind w:firstLine="288"/>
+      </w:pPr>
+      <w:r>
+        <w:rPr>
+          <w:rFonts w:ascii="EB Garamond" w:hAnsi="EB Garamond"/>
+          <w:b w:val="0"/>
+          <w:sz w:val="27"/>
+        </w:rPr>
         <w:t>One son lived past all that.</w:t>
       </w:r>
     </w:p>
@@ -5897,6 +6207,62 @@
           <w:b w:val="0"/>
           <w:sz w:val="27"/>
         </w:rPr>
+        <w:t>The book will let you hear the method once, because it is the whole pedagogy of the series and it will never be explained again. Wadha did not recite a poem to teach it. She dropped a hemistich into the ordinary air the way another woman might drop a proverb, and left the second half of the line unsaid, hanging, and went on sorting fruit; and the room learned that a line with its back half missing is an itch, and that a child or a husband will scratch it without being asked. She would say the half about the abandoned campsite, the beloved's traces in the sand — the oldest opening in the tongue — and let it hang.</w:t>
+      </w:r>
+    </w:p>
+    <w:p>
+      <w:pPr>
+        <w:spacing w:line="348" w:lineRule="auto" w:after="0" w:before="0"/>
+        <w:ind w:firstLine="288"/>
+      </w:pPr>
+      <w:r>
+        <w:rPr>
+          <w:rFonts w:ascii="EB Garamond" w:hAnsi="EB Garamond"/>
+          <w:b w:val="0"/>
+          <w:sz w:val="27"/>
+        </w:rPr>
+        <w:t>"And the rest?" Nura would say, because a child cannot bear an unfinished thing.</w:t>
+      </w:r>
+    </w:p>
+    <w:p>
+      <w:pPr>
+        <w:spacing w:line="348" w:lineRule="auto" w:after="0" w:before="0"/>
+        <w:ind w:firstLine="288"/>
+      </w:pPr>
+      <w:r>
+        <w:rPr>
+          <w:rFonts w:ascii="EB Garamond" w:hAnsi="EB Garamond"/>
+          <w:b w:val="0"/>
+          <w:sz w:val="27"/>
+        </w:rPr>
+        <w:t>"You tell me the rest," Wadha said. "You heard it last winter."</w:t>
+      </w:r>
+    </w:p>
+    <w:p>
+      <w:pPr>
+        <w:spacing w:line="348" w:lineRule="auto" w:after="0" w:before="0"/>
+        <w:ind w:firstLine="288"/>
+      </w:pPr>
+      <w:r>
+        <w:rPr>
+          <w:rFonts w:ascii="EB Garamond" w:hAnsi="EB Garamond"/>
+          <w:b w:val="0"/>
+          <w:sz w:val="27"/>
+        </w:rPr>
+        <w:t>And Nura, frowning, would find it — not the words at first, only the shape, the number of beats, the place the voice had to fall — and then the words would arrive to fit the shape, the way water finds the level cut for it. That was how the poems had traveled a thousand years and would travel a thousand more: not as pages to be guarded but as shapes cut into children, waiting for the words to pour back in. Wadha was not storing verses in Nura. She was cutting the channels. The verses would find their own way down them for the rest of the girl's life.</w:t>
+      </w:r>
+    </w:p>
+    <w:p>
+      <w:pPr>
+        <w:spacing w:line="348" w:lineRule="auto" w:after="0" w:before="0"/>
+        <w:ind w:firstLine="288"/>
+      </w:pPr>
+      <w:r>
+        <w:rPr>
+          <w:rFonts w:ascii="EB Garamond" w:hAnsi="EB Garamond"/>
+          <w:b w:val="0"/>
+          <w:sz w:val="27"/>
+        </w:rPr>
         <w:t>They ground wheat. They banked the fire. They poured coffee for guests with the right hand and the right pauses. Talal, aging now, still did not cook and still knew exactly whose hands he owed. Fahd coiled every rope with his coast grammar in it. Uthman grew into a tall quiet. The oasis turned on pollen and patience and the rota.</w:t>
       </w:r>
     </w:p>
@@ -6788,77 +7154,147 @@
           <w:b w:val="0"/>
           <w:sz w:val="27"/>
         </w:rPr>
-        <w:t>"Is she fast?" asked a buyer with a foreigner's coin behind him, through an interpreter, of a mare that had just stood a hard dry week without once faltering.</w:t>
-      </w:r>
-    </w:p>
-    <w:p>
-      <w:pPr>
-        <w:spacing w:line="348" w:lineRule="auto" w:after="0" w:before="0"/>
-        <w:ind w:firstLine="288"/>
-      </w:pPr>
-      <w:r>
-        <w:rPr>
-          <w:rFonts w:ascii="EB Garamond" w:hAnsi="EB Garamond"/>
-          <w:b w:val="0"/>
-          <w:sz w:val="27"/>
-        </w:rPr>
-        <w:t>"She is true," the owner said. "Fast is the word a man uses when he has not yet asked her to suffer."</w:t>
-      </w:r>
-    </w:p>
-    <w:p>
-      <w:pPr>
-        <w:spacing w:line="348" w:lineRule="auto" w:after="0" w:before="0"/>
-        <w:ind w:firstLine="288"/>
-      </w:pPr>
-      <w:r>
-        <w:rPr>
-          <w:rFonts w:ascii="EB Garamond" w:hAnsi="EB Garamond"/>
-          <w:b w:val="0"/>
-          <w:sz w:val="27"/>
-        </w:rPr>
-        <w:t>Khamis filed that too.</w:t>
-      </w:r>
-    </w:p>
-    <w:p>
-      <w:pPr>
-        <w:spacing w:line="348" w:lineRule="auto" w:after="0" w:before="0"/>
-        <w:ind w:firstLine="288"/>
-      </w:pPr>
-      <w:r>
-        <w:rPr>
-          <w:rFonts w:ascii="EB Garamond" w:hAnsi="EB Garamond"/>
-          <w:b w:val="0"/>
-          <w:sz w:val="27"/>
-        </w:rPr>
-        <w:t>When the story of the Englishwoman's mare reached Ghadir — carried home and worn smooth by the usual inaccuracies of a traveled tale — an old man in the majlis said, "They buy the blood and leave us the dust."</w:t>
-      </w:r>
-    </w:p>
-    <w:p>
-      <w:pPr>
-        <w:spacing w:line="348" w:lineRule="auto" w:after="0" w:before="0"/>
-        <w:ind w:firstLine="288"/>
-      </w:pPr>
-      <w:r>
-        <w:rPr>
-          <w:rFonts w:ascii="EB Garamond" w:hAnsi="EB Garamond"/>
-          <w:b w:val="0"/>
-          <w:sz w:val="27"/>
-        </w:rPr>
-        <w:t>"They buy what we agree to sell," said another. "Do not weep after the silver once your own hand has taken it."</w:t>
-      </w:r>
-    </w:p>
-    <w:p>
-      <w:pPr>
-        <w:spacing w:line="348" w:lineRule="auto" w:after="0" w:before="0"/>
-        <w:ind w:firstLine="288"/>
-      </w:pPr>
-      <w:r>
-        <w:rPr>
-          <w:rFonts w:ascii="EB Garamond" w:hAnsi="EB Garamond"/>
-          <w:b w:val="0"/>
-          <w:sz w:val="27"/>
-        </w:rPr>
-        <w:t>Khamis, listening to both, thought of pearl grades called low on purpose, and wondered what a dam-line would sound like recited not for the truth of it but for a buyer's hunger. He did not yet know that the years ahead would set him down inside that exact question. For now he only sharpened the eye.</w:t>
+        <w:t>On a trading loop that brushed the edge of Ha'il's country, Khamis stood in a yard and heard mares' pedigrees recited the way men recite the genealogies of saints — this one out of that dam, and that dam out of the strain the whole district could vouch for, back and back, no paper anywhere in it and none wanted. He listened. He did not yet know how much of his own last years would run through that listening. He knew only that the eye he had trained on goats, and on escort-men, and on pearl-grades, would read a horse as well, and that the man selling and the man buying did not always mean the same thing by the word worth.</w:t>
+      </w:r>
+    </w:p>
+    <w:p>
+      <w:pPr>
+        <w:spacing w:line="348" w:lineRule="auto" w:after="0" w:before="0"/>
+        <w:ind w:firstLine="288"/>
+      </w:pPr>
+      <w:r>
+        <w:rPr>
+          <w:rFonts w:ascii="EB Garamond" w:hAnsi="EB Garamond"/>
+          <w:b w:val="0"/>
+          <w:sz w:val="27"/>
+        </w:rPr>
+        <w:t>The book will let you stand in that yard a moment longer, because what Khamis heard there is a seed the later chapters will spend.</w:t>
+      </w:r>
+    </w:p>
+    <w:p>
+      <w:pPr>
+        <w:spacing w:line="348" w:lineRule="auto" w:after="0" w:before="0"/>
+        <w:ind w:firstLine="288"/>
+      </w:pPr>
+      <w:r>
+        <w:rPr>
+          <w:rFonts w:ascii="EB Garamond" w:hAnsi="EB Garamond"/>
+          <w:b w:val="0"/>
+          <w:sz w:val="27"/>
+        </w:rPr>
+        <w:t>A buyer had come with a foreigner's coin behind him, and an interpreter in front of him, and he wanted a grey mare that had just stood a hard dry week without once faltering.</w:t>
+      </w:r>
+    </w:p>
+    <w:p>
+      <w:pPr>
+        <w:spacing w:line="348" w:lineRule="auto" w:after="0" w:before="0"/>
+        <w:ind w:firstLine="288"/>
+      </w:pPr>
+      <w:r>
+        <w:rPr>
+          <w:rFonts w:ascii="EB Garamond" w:hAnsi="EB Garamond"/>
+          <w:b w:val="0"/>
+          <w:sz w:val="27"/>
+        </w:rPr>
+        <w:t>"Is she fast?" the buyer asked, through the interpreter.</w:t>
+      </w:r>
+    </w:p>
+    <w:p>
+      <w:pPr>
+        <w:spacing w:line="348" w:lineRule="auto" w:after="0" w:before="0"/>
+        <w:ind w:firstLine="288"/>
+      </w:pPr>
+      <w:r>
+        <w:rPr>
+          <w:rFonts w:ascii="EB Garamond" w:hAnsi="EB Garamond"/>
+          <w:b w:val="0"/>
+          <w:sz w:val="27"/>
+        </w:rPr>
+        <w:t>The owner, an old man of the district, did not answer for a moment. Then he said, "She is true. Fast is the word a man uses when he has not yet asked her to suffer."</w:t>
+      </w:r>
+    </w:p>
+    <w:p>
+      <w:pPr>
+        <w:spacing w:line="348" w:lineRule="auto" w:after="0" w:before="0"/>
+        <w:ind w:firstLine="288"/>
+      </w:pPr>
+      <w:r>
+        <w:rPr>
+          <w:rFonts w:ascii="EB Garamond" w:hAnsi="EB Garamond"/>
+          <w:b w:val="0"/>
+          <w:sz w:val="27"/>
+        </w:rPr>
+        <w:t>"Tell me her sire," the buyer said.</w:t>
+      </w:r>
+    </w:p>
+    <w:p>
+      <w:pPr>
+        <w:spacing w:line="348" w:lineRule="auto" w:after="0" w:before="0"/>
+        <w:ind w:firstLine="288"/>
+      </w:pPr>
+      <w:r>
+        <w:rPr>
+          <w:rFonts w:ascii="EB Garamond" w:hAnsi="EB Garamond"/>
+          <w:b w:val="0"/>
+          <w:sz w:val="27"/>
+        </w:rPr>
+        <w:t>The old man's face did something small and final, the way a door does when it is decided but not yet shut. "You ask me her sire," he said. "A foreigner always asks the sire, because a foreigner counts through the fathers, as if a horse were a kingdom. We count her through the dams. Recite the dams, or you have not asked after the horse at all — you have only asked after a rumor with legs."</w:t>
+      </w:r>
+    </w:p>
+    <w:p>
+      <w:pPr>
+        <w:spacing w:line="348" w:lineRule="auto" w:after="0" w:before="0"/>
+        <w:ind w:firstLine="288"/>
+      </w:pPr>
+      <w:r>
+        <w:rPr>
+          <w:rFonts w:ascii="EB Garamond" w:hAnsi="EB Garamond"/>
+          <w:b w:val="0"/>
+          <w:sz w:val="27"/>
+        </w:rPr>
+        <w:t>He recited them. Khamis, standing at the edge with the other men, watched the buyer's interpreter struggle to carry the names across, and watched the buyer nod at the sound without hearing the weight, and understood something he would not have words for until he was an old man himself: that two men can stand over the same animal and one of them is buying a week's speed and the other is selling a hundred years of kept memory, and that the price they agree on will be fair to neither, because it is not a price for the same thing.</w:t>
+      </w:r>
+    </w:p>
+    <w:p>
+      <w:pPr>
+        <w:spacing w:line="348" w:lineRule="auto" w:after="0" w:before="0"/>
+        <w:ind w:firstLine="288"/>
+      </w:pPr>
+      <w:r>
+        <w:rPr>
+          <w:rFonts w:ascii="EB Garamond" w:hAnsi="EB Garamond"/>
+          <w:b w:val="0"/>
+          <w:sz w:val="27"/>
+        </w:rPr>
+        <w:t>The mare was sold. The silver was good. The old man took it and did not smile, and later, over coffee, he said the thing Khamis carried away: "They buy the blood and leave us the reciting. In one generation their grandsons will have the horse and we will have the poem about the horse, and they will believe they were cheated, and so will we, and only one of us will be able to prove it on paper." He drank. "Guard your memory harder than your mare. The mare they can lead away. The memory they have to be taught, and a man can refuse to teach."</w:t>
+      </w:r>
+    </w:p>
+    <w:p>
+      <w:pPr>
+        <w:spacing w:line="348" w:lineRule="auto" w:after="0" w:before="0"/>
+        <w:ind w:firstLine="288"/>
+      </w:pPr>
+      <w:r>
+        <w:rPr>
+          <w:rFonts w:ascii="EB Garamond" w:hAnsi="EB Garamond"/>
+          <w:b w:val="0"/>
+          <w:sz w:val="27"/>
+        </w:rPr>
+        <w:t>Khamis filed that too — not knowing that a Rashidi commander's request was already riding toward Ghadir, and that the question of what a thing is worth, and to whom, and who goes home cheated knowing it, was about to walk in wearing a sword and bringing a daughter.</w:t>
+      </w:r>
+    </w:p>
+    <w:p>
+      <w:pPr>
+        <w:spacing w:line="348" w:lineRule="auto" w:after="0" w:before="0"/>
+        <w:ind w:firstLine="288"/>
+      </w:pPr>
+      <w:r>
+        <w:rPr>
+          <w:rFonts w:ascii="EB Garamond" w:hAnsi="EB Garamond"/>
+          <w:b w:val="0"/>
+          <w:sz w:val="27"/>
+        </w:rPr>
+        <w:t>When the story of the Englishwoman's mare reached Ghadir — carried home and worn smooth by the usual inaccuracies of a traveled tale — an old man in the majlis said only, "They buy the blood and leave us the dust," and no one in the yard disagreed, and Khamis thought of the grey mare and the recited dams and said nothing, because he had already heard the truer version of the sentence spoken by the man who was losing the horse.</w:t>
       </w:r>
     </w:p>
     <w:p>

</xml_diff>